<commit_message>
refactor: replace pdf/title page with full and anonymous docx files; update script
</commit_message>
<xml_diff>
--- a/networking/jsdh/Manuscript_Anonymous.docx
+++ b/networking/jsdh/Manuscript_Anonymous.docx
@@ -35,15 +35,7 @@
         <w:pStyle w:val="FirstParagraph"/>
       </w:pPr>
       <w:r>
-        <w:t xml:space="preserve">Modern municipal policy responses to chronic unsheltered homelessness remain constrained by sociological models and administrative case management (Tsemberis et al., 2004). To address extreme precarity, this conceptual paper proposes a mechanical, systems-based public utility model. Dismantling prefrontal cortex function, street exposure, chronic sleep deprivation, and environmental trauma invalidate the standard political assumption of rational choice (Westbrook &amp; Robinson, 2021). Universal dignity rests on human nature rather than performance or functional capacity (Shilling, 2012). Under this construct, building a secular natural law structure based on biological survival needs establishes the moral legitimacy of compelled clinical care in clinical-housing environments (Gowan, 2010). Bridging the gap between physical engineering, public policy, and moral law, this capstone establishes that mainstream policy designs fail to account for the physical requirements of biological agency under conditions of extreme environmental trauma (Shilling, 2012). Subsequent psychological and economic recovery must be built on the foundation of immediate biological stabilization (Westbrook &amp; Robinson, 2021).</w:t>
-      </w:r>
-    </w:p>
-    <w:p>
-      <w:pPr>
-        <w:pStyle w:val="BodyText"/>
-      </w:pPr>
-      <w:r>
-        <w:t xml:space="preserve">Keywords include chronic homelessness, moral physics, cognitive agency, survival infrastructure, public utility, compelled care.</w:t>
+        <w:t xml:space="preserve">Keywords: chronic homelessness, moral physics, cognitive agency, survival infrastructure, public utility, compelled care</w:t>
       </w:r>
     </w:p>
     <w:bookmarkEnd w:id="21"/>

</xml_diff>

<commit_message>
fix: author meta & abstract extraction in jsdh docs; regenerate docx
</commit_message>
<xml_diff>
--- a/networking/jsdh/Manuscript_Anonymous.docx
+++ b/networking/jsdh/Manuscript_Anonymous.docx
@@ -33,6 +33,14 @@
     <w:p>
       <w:pPr>
         <w:pStyle w:val="FirstParagraph"/>
+      </w:pPr>
+      <w:r>
+        <w:t xml:space="preserve">Modern municipal policy responses to chronic unsheltered homelessness remain constrained by sociological models and administrative case management (Tsemberis et al., 2004). To address extreme precarity, this conceptual paper proposes a mechanical, systems-based public utility model. Dismantling prefrontal cortex function, street exposure, chronic sleep deprivation, and environmental trauma invalidate the standard political assumption of rational choice (Westbrook &amp; Robinson, 2021). Universal dignity rests on human nature rather than performance or functional capacity (Shilling, 2012). Under this construct, building a secular natural law structure based on biological survival needs establishes the moral legitimacy of compelled clinical care in clinical-housing environments (Gowan, 2010). Bridging the gap between physical engineering, public policy, and moral law, this capstone establishes that mainstream policy designs fail to account for the physical requirements of biological agency under conditions of extreme environmental trauma (Shilling, 2012). Subsequent psychological and economic recovery must be built on the foundation of immediate biological stabilization (Westbrook &amp; Robinson, 2021).</w:t>
+      </w:r>
+    </w:p>
+    <w:p>
+      <w:pPr>
+        <w:pStyle w:val="BodyText"/>
       </w:pPr>
       <w:r>
         <w:t xml:space="preserve">Keywords: chronic homelessness, moral physics, cognitive agency, survival infrastructure, public utility, compelled care</w:t>

</xml_diff>

<commit_message>
Update JSDH manuscript with Capability Approach and System Matrix; synchronize DOCX binaries
</commit_message>
<xml_diff>
--- a/networking/jsdh/Manuscript_Anonymous.docx
+++ b/networking/jsdh/Manuscript_Anonymous.docx
@@ -2,7 +2,7 @@
 <file path=word/document.xml><?xml version="1.0" encoding="utf-8"?>
 <w:document xmlns:w="http://schemas.openxmlformats.org/wordprocessingml/2006/main" xmlns:m="http://schemas.openxmlformats.org/officeDocument/2006/math" xmlns:r="http://schemas.openxmlformats.org/officeDocument/2006/relationships" xmlns:o="urn:schemas-microsoft-com:office:office" xmlns:v="urn:schemas-microsoft-com:vml" xmlns:w10="urn:schemas-microsoft-com:office:word" xmlns:a="http://schemas.openxmlformats.org/drawingml/2006/main" xmlns:pic="http://schemas.openxmlformats.org/drawingml/2006/picture" xmlns:wp="http://schemas.openxmlformats.org/drawingml/2006/wordprocessingDrawing">
   <w:body>
-    <w:bookmarkStart w:id="52" w:name="the-moral-physics-of-survival"/>
+    <w:bookmarkStart w:id="54" w:name="the-moral-physics-of-survival"/>
     <w:p>
       <w:pPr>
         <w:pStyle w:val="Heading1"/>
@@ -321,7 +321,7 @@
     </w:p>
     <w:bookmarkEnd w:id="29"/>
     <w:bookmarkEnd w:id="30"/>
-    <w:bookmarkStart w:id="35" w:name="methodology"/>
+    <w:bookmarkStart w:id="36" w:name="methodology"/>
     <w:p>
       <w:pPr>
         <w:pStyle w:val="Heading2"/>
@@ -498,8 +498,34 @@
       </w:r>
     </w:p>
     <w:bookmarkEnd w:id="34"/>
+    <w:bookmarkStart w:id="35" w:name="X0830eff780d096d9c172d11e7706a21ead0bb0d"/>
+    <w:p>
+      <w:pPr>
+        <w:pStyle w:val="Heading3"/>
+      </w:pPr>
+      <w:r>
+        <w:t xml:space="preserve">3.5 The Capability Approach and Sequential Resolution</w:t>
+      </w:r>
+    </w:p>
+    <w:p>
+      <w:pPr>
+        <w:pStyle w:val="FirstParagraph"/>
+      </w:pPr>
+      <w:r>
+        <w:t xml:space="preserve">The proposed model operationalizes Amartya Sen’s Capability Approach and Martha Nussbaum’s human rights list. Sen argues that well-being depends on real freedom to achieve functionings, which requires internal and external conversion factors (Sen, 1999). Chronic street survival degrades a person’s internal cognitive conversion capacity, making it impossible to utilize standard housing resources (Batterham, 2020).</w:t>
+      </w:r>
+    </w:p>
+    <w:p>
+      <w:pPr>
+        <w:pStyle w:val="BodyText"/>
+      </w:pPr>
+      <w:r>
+        <w:t xml:space="preserve">Nussbaum argues that societies must guarantee basic physical thresholds, defined as Life, Bodily Health, and Bodily Integrity, as a prerequisite for human dignity (Nussbaum, 2011). The MDI model resolves the debate between Nussbaum’s universal list and Sen’s democratic agency by structuring them into a chronological sequence (Crocker, 2008). Phase Zero functions as the Nussbaum Phase, enforcing biological stability and physical safety through clinical environment design. Once biological baselines are restored, the individual transitions to a self-governed Dunbar Pod, the Sen Phase, regaining agency and participating in pod councils. This sequential resolution proves that constitutional justice requires securing basic physiological thresholds before demanding democratic agency.</w:t>
+      </w:r>
+    </w:p>
     <w:bookmarkEnd w:id="35"/>
-    <w:bookmarkStart w:id="39" w:name="findings"/>
+    <w:bookmarkEnd w:id="36"/>
+    <w:bookmarkStart w:id="40" w:name="findings"/>
     <w:p>
       <w:pPr>
         <w:pStyle w:val="Heading2"/>
@@ -508,7 +534,7 @@
         <w:t xml:space="preserve">4. Findings</w:t>
       </w:r>
     </w:p>
-    <w:bookmarkStart w:id="36" w:name="X4c2f8908871593b43471e946523418e3125eefe"/>
+    <w:bookmarkStart w:id="37" w:name="X4c2f8908871593b43471e946523418e3125eefe"/>
     <w:p>
       <w:pPr>
         <w:pStyle w:val="Heading3"/>
@@ -549,8 +575,8 @@
         <w:t xml:space="preserve">This philosophical gap has significant legal implications. If the social contract is broken by the state’s failure to guarantee survival conditions, then the state cannot ethically enforce laws criminalizing homeless survival behaviors. Laws prohibiting sleeping in public or camping on public land are invalid because they penalize individuals for actions necessary to avoid death in the absence of state-provided alternatives.</w:t>
       </w:r>
     </w:p>
-    <w:bookmarkEnd w:id="36"/>
-    <w:bookmarkStart w:id="37" w:name="X41f8b43d992cef51a1272bb18416a059b8573f8"/>
+    <w:bookmarkEnd w:id="37"/>
+    <w:bookmarkStart w:id="38" w:name="X41f8b43d992cef51a1272bb18416a059b8573f8"/>
     <w:p>
       <w:pPr>
         <w:pStyle w:val="Heading3"/>
@@ -599,8 +625,8 @@
         <w:t xml:space="preserve">To maintain compliance with human rights standards, the compulsion process must include regular judicial review and clear clinical markers for discharge. The state must bear the burden of proof, demonstrating that the individual remains incapable of self-preservation due to documented cognitive impairment. This legal structure protects individual liberty while verifying that the obligation to care is fulfilled.</w:t>
       </w:r>
     </w:p>
-    <w:bookmarkEnd w:id="37"/>
-    <w:bookmarkStart w:id="38" w:name="the-civic-hierarchy-of-obligation"/>
+    <w:bookmarkEnd w:id="38"/>
+    <w:bookmarkStart w:id="39" w:name="the-civic-hierarchy-of-obligation"/>
     <w:p>
       <w:pPr>
         <w:pStyle w:val="Heading3"/>
@@ -641,9 +667,9 @@
         <w:t xml:space="preserve">This hierarchy also demands that public spaces be designed to support survival rather than displace it. Hostile design must be replaced with supportive design, so that public infrastructure is configured to meet the biological needs of all citizens.</w:t>
       </w:r>
     </w:p>
-    <w:bookmarkEnd w:id="38"/>
     <w:bookmarkEnd w:id="39"/>
-    <w:bookmarkStart w:id="43" w:name="discussion"/>
+    <w:bookmarkEnd w:id="40"/>
+    <w:bookmarkStart w:id="45" w:name="discussion"/>
     <w:p>
       <w:pPr>
         <w:pStyle w:val="Heading2"/>
@@ -652,7 +678,7 @@
         <w:t xml:space="preserve">5. Discussion</w:t>
       </w:r>
     </w:p>
-    <w:bookmarkStart w:id="40" w:name="Xfc6e5ab2a0ae45f514075fdaf0be295d10234a6"/>
+    <w:bookmarkStart w:id="41" w:name="Xfc6e5ab2a0ae45f514075fdaf0be295d10234a6"/>
     <w:p>
       <w:pPr>
         <w:pStyle w:val="Heading3"/>
@@ -701,8 +727,8 @@
         <w:t xml:space="preserve">The concrete slab foundation for each pod must be engineered for seismic stability and rapid deployment. It must include pre-cast utility channels that interface with municipal main lines when available, or support self-contained storage tanks when grid access is absent. The structural frame must withstand a wind load of 120 miles per hour, protecting occupants during severe weather events.</w:t>
       </w:r>
     </w:p>
-    <w:bookmarkEnd w:id="40"/>
-    <w:bookmarkStart w:id="41" w:name="Xe5ff830a7200d4fbf3c613417e13cfee7c2f9f6"/>
+    <w:bookmarkEnd w:id="41"/>
+    <w:bookmarkStart w:id="42" w:name="Xe5ff830a7200d4fbf3c613417e13cfee7c2f9f6"/>
     <w:p>
       <w:pPr>
         <w:pStyle w:val="Heading3"/>
@@ -751,8 +777,8 @@
         <w:t xml:space="preserve">To maintain protection without relying on traditional police presence, the towers must incorporate automated entry vestibules and biometric verification systems. These systems verify the identity of residents and manage access to clinical areas without requiring invasive security personnel. The security design must emphasize architectural solutions, such as clear sightlines and controlled access points, to create a protected environment for both staff and residents.</w:t>
       </w:r>
     </w:p>
-    <w:bookmarkEnd w:id="41"/>
-    <w:bookmarkStart w:id="42" w:name="cost-benefit-analysis-and-public-finance"/>
+    <w:bookmarkEnd w:id="42"/>
+    <w:bookmarkStart w:id="43" w:name="cost-benefit-analysis-and-public-finance"/>
     <w:p>
       <w:pPr>
         <w:pStyle w:val="Heading3"/>
@@ -801,9 +827,35 @@
         <w:t xml:space="preserve">To implement this model, municipalities must establish partnerships with private healthcare networks. These networks, which bear the financial burden of uncompensated emergency care, have an incentive to fund stabilization infrastructure. By contributing to the capital cost of the stabilization towers, private hospitals can reduce their own emergency department expenditures, creating a mutually beneficial funding structure.</w:t>
       </w:r>
     </w:p>
-    <w:bookmarkEnd w:id="42"/>
     <w:bookmarkEnd w:id="43"/>
-    <w:bookmarkStart w:id="46" w:name="conclusion"/>
+    <w:bookmarkStart w:id="44" w:name="comparative-system-analysis"/>
+    <w:p>
+      <w:pPr>
+        <w:pStyle w:val="Heading3"/>
+      </w:pPr>
+      <w:r>
+        <w:t xml:space="preserve">5.4 Comparative System Analysis</w:t>
+      </w:r>
+    </w:p>
+    <w:p>
+      <w:pPr>
+        <w:pStyle w:val="FirstParagraph"/>
+      </w:pPr>
+      <w:r>
+        <w:t xml:space="preserve">Evaluating alternative infrastructure models across speed, cost, regulatory feasibility, and long-term stability demonstrates the systemic necessity of integrated MDI. Alternative frameworks include Autonomous Mobile Fleet Deployment (AMFD), Tax-Credit Decentralized Micro-Zoning (TDMZ), Universal Infrastructure Vouchers (UBIV), and standalone Automated Office-to-Pod Conversion (AOPC).</w:t>
+      </w:r>
+    </w:p>
+    <w:p>
+      <w:pPr>
+        <w:pStyle w:val="BodyText"/>
+      </w:pPr>
+      <w:r>
+        <w:t xml:space="preserve">Standalone AOPC rapidly retrofits commercial towers but fails because it lacks the Phase Zero metabolic stabilization layer, placing traumatized brains into independent apartments without addressing their damaged biology. AMFD provides rapid deployment through heavy-duty industrial vehicles but faces high municipal opposition and fails to provide long-term residential stability. TDMZ encounters local zoning battles and lacks the clinical concentration needed for medical delivery. Integrated MDI remains the only structurally complete solution because it synchronizes physical skyscraper conversions with biological triage and localized pod governance, succeeding where partial infrastructure models fail.</w:t>
+      </w:r>
+    </w:p>
+    <w:bookmarkEnd w:id="44"/>
+    <w:bookmarkEnd w:id="45"/>
+    <w:bookmarkStart w:id="48" w:name="conclusion"/>
     <w:p>
       <w:pPr>
         <w:pStyle w:val="Heading2"/>
@@ -812,7 +864,7 @@
         <w:t xml:space="preserve">6. Conclusion</w:t>
       </w:r>
     </w:p>
-    <w:bookmarkStart w:id="44" w:name="summary-of-the-model-shift"/>
+    <w:bookmarkStart w:id="46" w:name="summary-of-the-model-shift"/>
     <w:p>
       <w:pPr>
         <w:pStyle w:val="Heading3"/>
@@ -853,8 +905,8 @@
         <w:t xml:space="preserve">This model shift requires a rejection of the voluntaristic housing models that dominate modern social policy. We must accept that when an individual’s cognitive agency has collapsed, the municipal government has a positive obligation to intervene, stabilize, and rebuild that agency. This commitment must be operationalized through permanent, standardized public infrastructure.</w:t>
       </w:r>
     </w:p>
-    <w:bookmarkEnd w:id="44"/>
-    <w:bookmarkStart w:id="45" w:name="future-research-directions"/>
+    <w:bookmarkEnd w:id="46"/>
+    <w:bookmarkStart w:id="47" w:name="future-research-directions"/>
     <w:p>
       <w:pPr>
         <w:pStyle w:val="Heading3"/>
@@ -895,9 +947,9 @@
         <w:t xml:space="preserve">The goal of this research is to establish design guidelines that make extreme precarity impossible. By engineering the city to support human biology, we can guarantee that the physical prerequisites of agency are protected for all, fulfilling the moral obligations of a civilized society.</w:t>
       </w:r>
     </w:p>
-    <w:bookmarkEnd w:id="45"/>
-    <w:bookmarkEnd w:id="46"/>
-    <w:bookmarkStart w:id="50" w:name="declarations"/>
+    <w:bookmarkEnd w:id="47"/>
+    <w:bookmarkEnd w:id="48"/>
+    <w:bookmarkStart w:id="52" w:name="declarations"/>
     <w:p>
       <w:pPr>
         <w:pStyle w:val="Heading2"/>
@@ -906,7 +958,7 @@
         <w:t xml:space="preserve">Declarations</w:t>
       </w:r>
     </w:p>
-    <w:bookmarkStart w:id="47" w:name="funding"/>
+    <w:bookmarkStart w:id="49" w:name="funding"/>
     <w:p>
       <w:pPr>
         <w:pStyle w:val="Heading3"/>
@@ -923,8 +975,8 @@
         <w:t xml:space="preserve">This work received no grant from any funding agency in the public, commercial, or not-for-profit sectors.</w:t>
       </w:r>
     </w:p>
-    <w:bookmarkEnd w:id="47"/>
-    <w:bookmarkStart w:id="48" w:name="disclosure-statement"/>
+    <w:bookmarkEnd w:id="49"/>
+    <w:bookmarkStart w:id="50" w:name="disclosure-statement"/>
     <w:p>
       <w:pPr>
         <w:pStyle w:val="Heading3"/>
@@ -941,8 +993,8 @@
         <w:t xml:space="preserve">No potential conflict of interest was reported by the authors.</w:t>
       </w:r>
     </w:p>
-    <w:bookmarkEnd w:id="48"/>
-    <w:bookmarkStart w:id="49" w:name="data-availability-statement"/>
+    <w:bookmarkEnd w:id="50"/>
+    <w:bookmarkStart w:id="51" w:name="data-availability-statement"/>
     <w:p>
       <w:pPr>
         <w:pStyle w:val="Heading3"/>
@@ -959,9 +1011,9 @@
         <w:t xml:space="preserve">Data sharing is not applicable to this article as no new datasets were created or analyzed.</w:t>
       </w:r>
     </w:p>
-    <w:bookmarkEnd w:id="49"/>
-    <w:bookmarkEnd w:id="50"/>
-    <w:bookmarkStart w:id="51" w:name="references"/>
+    <w:bookmarkEnd w:id="51"/>
+    <w:bookmarkEnd w:id="52"/>
+    <w:bookmarkStart w:id="53" w:name="references"/>
     <w:p>
       <w:pPr>
         <w:pStyle w:val="Heading2"/>
@@ -1083,6 +1135,132 @@
         <w:pStyle w:val="BodyText"/>
       </w:pPr>
       <w:r>
+        <w:t xml:space="preserve">Aravena, A. (2016).</w:t>
+      </w:r>
+      <w:r>
+        <w:t xml:space="preserve"> </w:t>
+      </w:r>
+      <w:r>
+        <w:rPr>
+          <w:iCs/>
+          <w:i/>
+        </w:rPr>
+        <w:t xml:space="preserve">Elemental: Incremental housing and participatory design manual</w:t>
+      </w:r>
+      <w:r>
+        <w:t xml:space="preserve">. Hatje Cantz.</w:t>
+      </w:r>
+    </w:p>
+    <w:p>
+      <w:pPr>
+        <w:pStyle w:val="BodyText"/>
+      </w:pPr>
+      <w:r>
+        <w:t xml:space="preserve">Batterham, D. (2020). Homelessness as capability deprivation: A conceptual model.</w:t>
+      </w:r>
+      <w:r>
+        <w:t xml:space="preserve"> </w:t>
+      </w:r>
+      <w:r>
+        <w:rPr>
+          <w:iCs/>
+          <w:i/>
+        </w:rPr>
+        <w:t xml:space="preserve">Housing, Theory and Society</w:t>
+      </w:r>
+      <w:r>
+        <w:t xml:space="preserve">, 37(3), 274-297.</w:t>
+      </w:r>
+    </w:p>
+    <w:p>
+      <w:pPr>
+        <w:pStyle w:val="BodyText"/>
+      </w:pPr>
+      <w:r>
+        <w:t xml:space="preserve">Crocker, D. A. (2008).</w:t>
+      </w:r>
+      <w:r>
+        <w:t xml:space="preserve"> </w:t>
+      </w:r>
+      <w:r>
+        <w:rPr>
+          <w:iCs/>
+          <w:i/>
+        </w:rPr>
+        <w:t xml:space="preserve">Ethics of global development: Agency, capability, and deliberative democracy</w:t>
+      </w:r>
+      <w:r>
+        <w:t xml:space="preserve">. Cambridge University Press.</w:t>
+      </w:r>
+    </w:p>
+    <w:p>
+      <w:pPr>
+        <w:pStyle w:val="BodyText"/>
+      </w:pPr>
+      <w:r>
+        <w:t xml:space="preserve">Nussbaum, M. C. (2011).</w:t>
+      </w:r>
+      <w:r>
+        <w:t xml:space="preserve"> </w:t>
+      </w:r>
+      <w:r>
+        <w:rPr>
+          <w:iCs/>
+          <w:i/>
+        </w:rPr>
+        <w:t xml:space="preserve">Creating capabilities: The human development approach</w:t>
+      </w:r>
+      <w:r>
+        <w:t xml:space="preserve">. Harvard University Press.</w:t>
+      </w:r>
+    </w:p>
+    <w:p>
+      <w:pPr>
+        <w:pStyle w:val="BodyText"/>
+      </w:pPr>
+      <w:r>
+        <w:t xml:space="preserve">Sen, A. (1999).</w:t>
+      </w:r>
+      <w:r>
+        <w:t xml:space="preserve"> </w:t>
+      </w:r>
+      <w:r>
+        <w:rPr>
+          <w:iCs/>
+          <w:i/>
+        </w:rPr>
+        <w:t xml:space="preserve">Development as freedom</w:t>
+      </w:r>
+      <w:r>
+        <w:t xml:space="preserve">. Oxford University Press.</w:t>
+      </w:r>
+    </w:p>
+    <w:p>
+      <w:pPr>
+        <w:pStyle w:val="BodyText"/>
+      </w:pPr>
+      <w:r>
+        <w:t xml:space="preserve">Shopworks Architecture. (2024).</w:t>
+      </w:r>
+      <w:r>
+        <w:t xml:space="preserve"> </w:t>
+      </w:r>
+      <w:r>
+        <w:rPr>
+          <w:iCs/>
+          <w:i/>
+        </w:rPr>
+        <w:t xml:space="preserve">Trauma-informed design in supportive housing: Physical environments and nervous system regulation</w:t>
+      </w:r>
+      <w:r>
+        <w:t xml:space="preserve">. Shopworks.</w:t>
+      </w:r>
+    </w:p>
+    <w:p>
+      <w:pPr>
+        <w:pStyle w:val="BodyText"/>
+      </w:pPr>
+      <w:r>
         <w:t xml:space="preserve">Westbrook, M., &amp; Robinson, T. (2021). Unhealthy by design: Health and safety consequences of the criminalization of homelessness.</w:t>
       </w:r>
       <w:r>
@@ -1099,8 +1277,8 @@
         <w:t xml:space="preserve">, 30(2), 107–115.</w:t>
       </w:r>
     </w:p>
-    <w:bookmarkEnd w:id="51"/>
-    <w:bookmarkEnd w:id="52"/>
+    <w:bookmarkEnd w:id="53"/>
+    <w:bookmarkEnd w:id="54"/>
     <w:sectPr/>
   </w:body>
 </w:document>

</xml_diff>

<commit_message>
chore(jsdh): finalize Phase 4 architectural refactoring and compile release binaries
</commit_message>
<xml_diff>
--- a/networking/jsdh/Manuscript_Anonymous.docx
+++ b/networking/jsdh/Manuscript_Anonymous.docx
@@ -2,7 +2,7 @@
 <file path=word/document.xml><?xml version="1.0" encoding="utf-8"?>
 <w:document xmlns:w="http://schemas.openxmlformats.org/wordprocessingml/2006/main" xmlns:m="http://schemas.openxmlformats.org/officeDocument/2006/math" xmlns:r="http://schemas.openxmlformats.org/officeDocument/2006/relationships" xmlns:o="urn:schemas-microsoft-com:office:office" xmlns:v="urn:schemas-microsoft-com:vml" xmlns:w10="urn:schemas-microsoft-com:office:word" xmlns:a="http://schemas.openxmlformats.org/drawingml/2006/main" xmlns:pic="http://schemas.openxmlformats.org/drawingml/2006/picture" xmlns:wp="http://schemas.openxmlformats.org/drawingml/2006/wordprocessingDrawing">
   <w:body>
-    <w:bookmarkStart w:id="54" w:name="the-moral-physics-of-survival"/>
+    <w:bookmarkStart w:id="55" w:name="the-moral-physics-of-survival"/>
     <w:p>
       <w:pPr>
         <w:pStyle w:val="Heading1"/>
@@ -35,7 +35,7 @@
         <w:pStyle w:val="FirstParagraph"/>
       </w:pPr>
       <w:r>
-        <w:t xml:space="preserve">Modern municipal policy responses to chronic unsheltered homelessness remain constrained by sociological models and administrative case management (Tsemberis et al., 2004). To address extreme precarity, this conceptual paper proposes a mechanical, systems-based public utility model. Dismantling prefrontal cortex function, street exposure, chronic sleep deprivation, and environmental trauma invalidate the standard political assumption of rational choice (Westbrook &amp; Robinson, 2021). Universal dignity rests on human nature rather than performance or functional capacity (Shilling, 2012). Under this construct, building a secular natural law structure based on biological survival needs establishes the moral legitimacy of compelled clinical care in clinical-housing environments (Gowan, 2010). Bridging the gap between physical engineering, public policy, and moral law, this capstone establishes that mainstream policy designs fail to account for the physical requirements of biological agency under conditions of extreme environmental trauma (Shilling, 2012). Subsequent psychological and economic recovery must be built on the foundation of immediate biological stabilization (Westbrook &amp; Robinson, 2021).</w:t>
+        <w:t xml:space="preserve">Modern municipal policy responses to chronic unsheltered homelessness remain constrained by sociological models and administrative case management (Tsemberis et al., 2004). To address extreme precarity, this conceptual paper proposes a normative theoretical framework for a mechanical, systems-based public utility model. Dismantling prefrontal cortex function, street exposure, chronic sleep deprivation, and environmental trauma invalidate the standard political assumption of rational choice (Westbrook &amp; Robinson, 2021). Universal dignity rests on human nature rather than performance or functional capacity (Maritain, 1951). Under this construct, building a secular natural law structure based on biological survival needs establishes the moral legitimacy of compelled clinical care in clinical-housing environments (Gowan, 2010). Bridging the gap between physical engineering, public policy, and moral law, this normative model argues that mainstream policy designs fail to account for the physical requirements of biological agency under conditions of extreme environmental trauma (McEwen, 2017). Subsequent psychological and economic recovery must be built on the foundation of immediate biological stabilization (Westbrook &amp; Robinson, 2021).</w:t>
       </w:r>
     </w:p>
     <w:p>
@@ -224,15 +224,15 @@
         <w:pStyle w:val="FirstParagraph"/>
       </w:pPr>
       <w:r>
-        <w:t xml:space="preserve">The human body requires physical conditions to maintain functional homeostasis and executive cognitive capacity. Through prolonged exposure to extreme environments, combined with persistent sleep deprivation, street precarity triggers chronic neurobiological stress. These stressors saturate neural tissue with cortisol, eventually dismantling prefrontal cortex function. Under these physiological conditions, the standard economic and political assumption of rational choice ceases to operate (Shilling, 2012). When cognitive agency collapses beneath a biological floor, expecting individuals to navigate complex bureaucratic housing queues is unreasonable (Tsemberis et al., 2004; Westbrook &amp; Robinson, 2021).</w:t>
-      </w:r>
-    </w:p>
-    <w:p>
-      <w:pPr>
-        <w:pStyle w:val="BodyText"/>
-      </w:pPr>
-      <w:r>
-        <w:t xml:space="preserve">Neurobiological research details the precise mechanisms by which environmental trauma alters brain architecture. Chronic stress activates the hypothalamic-pituitary-adrenal axis, triggering a sustained release of glucocorticoids. High concentrations of cortisol are neurotoxic, particularly in the prefrontal cortex and the hippocampus. In the prefrontal cortex, chronic cortisol exposure causes dendrite retraction and loss of dendritic spines, reducing the brain’s capacity for working memory, executive planning, and impulse regulation.</w:t>
+        <w:t xml:space="preserve">The human body requires physical conditions to maintain functional homeostasis and executive cognitive capacity. Through prolonged exposure to extreme environments, combined with persistent sleep deprivation, street precarity triggers chronic neurobiological stress. These stressors saturate neural tissue with cortisol, eventually dismantling prefrontal cortex function. Under these physiological conditions, the standard economic and political assumption of rational choice ceases to operate. When cognitive agency collapses beneath a biological floor, expecting individuals to navigate complex bureaucratic housing queues is unreasonable (Tsemberis et al., 2004; Westbrook &amp; Robinson, 2021).</w:t>
+      </w:r>
+    </w:p>
+    <w:p>
+      <w:pPr>
+        <w:pStyle w:val="BodyText"/>
+      </w:pPr>
+      <w:r>
+        <w:t xml:space="preserve">Neurobiological research details the precise mechanisms by which environmental trauma alters brain architecture. Chronic stress activates the hypothalamic-pituitary-adrenal axis, triggering a sustained release of glucocorticoids (McEwen, 2017). Sustained high concentrations of cortisol are associated with neurotoxic effects, particularly in the prefrontal cortex and the hippocampus (Sapolsky, 2004). In the prefrontal cortex, chronic cortisol exposure frequently correlates with dendrite retraction and loss of dendritic spines, reducing the brain’s capacity for working memory, executive planning, and impulse regulation (Arnsten, 2009).</w:t>
       </w:r>
     </w:p>
     <w:p>
@@ -321,13 +321,13 @@
     </w:p>
     <w:bookmarkEnd w:id="29"/>
     <w:bookmarkEnd w:id="30"/>
-    <w:bookmarkStart w:id="36" w:name="methodology"/>
+    <w:bookmarkStart w:id="36" w:name="conceptual-framework"/>
     <w:p>
       <w:pPr>
         <w:pStyle w:val="Heading2"/>
       </w:pPr>
       <w:r>
-        <w:t xml:space="preserve">3. Methodology</w:t>
+        <w:t xml:space="preserve">3. Conceptual Framework</w:t>
       </w:r>
     </w:p>
     <w:bookmarkStart w:id="31" w:name="Xea888c6f43c1d240f70c40a348ada2d9ebf5b60"/>
@@ -344,15 +344,15 @@
         <w:pStyle w:val="FirstParagraph"/>
       </w:pPr>
       <w:r>
-        <w:t xml:space="preserve">Evaluating human dignity requires constructing a secular, empirical ethical construct rooted in biological survival needs. Rather than linking dignity to performance, functional capacity, or social utility, this model anchors moral status in human nature itself (Shilling, 2012). This grounding establishes objective material standards for public policy (Gowan, 2010). To prevent systemic abandonment, municipalities must prioritize immediate physiological stabilization by providing access to temperature regulation, protected sleep, and sanitation.</w:t>
-      </w:r>
-    </w:p>
-    <w:p>
-      <w:pPr>
-        <w:pStyle w:val="BodyText"/>
-      </w:pPr>
-      <w:r>
-        <w:t xml:space="preserve">Our methodology treats human agency as a thermodynamic property rather than an abstract philosophical concept. A human being is an open thermodynamic system that must continuously import negative entropy in the form of food, water, and shelter to counteract the natural progression toward entropy and decay. When the environment prevents the acquisition of these resources, the system degrades.</w:t>
+        <w:t xml:space="preserve">Evaluating human dignity requires constructing a secular, empirical ethical construct rooted in biological survival needs. Rather than linking dignity to performance, functional capacity, or social utility, this model anchors moral status in human nature itself (Maritain, 1951). This grounding establishes objective material standards for public policy (Gowan, 2010). To prevent systemic abandonment, municipalities must prioritize immediate physiological stabilization by providing access to temperature regulation, protected sleep, and sanitation.</w:t>
+      </w:r>
+    </w:p>
+    <w:p>
+      <w:pPr>
+        <w:pStyle w:val="BodyText"/>
+      </w:pPr>
+      <w:r>
+        <w:t xml:space="preserve">Our conceptual framework utilizes thermodynamics as an analogical heuristic rather than a formal mathematical model. By treating human agency as a thermodynamic property, this heuristic illustrates how a human being operates as an open system that must continuously import negative entropy in the form of food, water, and shelter to counteract the natural progression toward entropy and decay. When the environment prevents the acquisition of these resources, the system degrades.</w:t>
       </w:r>
     </w:p>
     <w:p>
@@ -368,7 +368,15 @@
         <w:pStyle w:val="BodyText"/>
       </w:pPr>
       <w:r>
-        <w:t xml:space="preserve">From a thermodynamic perspective, the body must perform continuous work to maintain its internal boundary conditions against external fluctuations. Under street conditions, the rate of entropy production exceeds the system’s capacity for entropy dissipation, resulting in structural disorganization. This disorganization manifests as physical tissue decay and cognitive impairment. Our ethical structure is derived from the physical requirement to arrest this entropic slide.</w:t>
+        <w:t xml:space="preserve">From a thermodynamic perspective, the body must perform continuous work to maintain its internal boundary conditions against external fluctuations. Under street conditions, the rate of entropy production exceeds the system’s capacity for entropy dissipation, resulting in structural disorganization. This disorganization manifests as physical tissue decay and cognitive impairment.</w:t>
+      </w:r>
+    </w:p>
+    <w:p>
+      <w:pPr>
+        <w:pStyle w:val="BodyText"/>
+      </w:pPr>
+      <w:r>
+        <w:t xml:space="preserve">Our ethical structure is derived from the physical requirement to arrest this entropic slide. Because biological life is the necessary substrate for all moral and political action, the laws governing biological persistence—thermodynamic maintenance—generate a foundational tier of moral obligation. If a society claims to value human life, it is logically compelled to provide the material conditions required to sustain it. Entropy, therefore, is not merely a physical process but a normative boundary: crossing the homeostatic threshold destroys the individual’s capacity to participate in the moral community.</w:t>
       </w:r>
     </w:p>
     <w:p>
@@ -486,15 +494,15 @@
         <w:pStyle w:val="FirstParagraph"/>
       </w:pPr>
       <w:r>
-        <w:t xml:space="preserve">To operationalize secular natural law, we must establish quantitative biological metrics for the survival floor. Clinical physiology defines the human homeostatic envelope through environmental and metabolic boundaries. Thermoregulation requires an ambient temperature range between 65 and 75 degrees Fahrenheit to minimize the metabolic work of shivering or sweating. The body requires a minimum daily intake of 2.5 liters of clean water and 2200 kilocalories of nutritionally balanced inputs to maintain cellular function and prevent cachexia.</w:t>
-      </w:r>
-    </w:p>
-    <w:p>
-      <w:pPr>
-        <w:pStyle w:val="BodyText"/>
-      </w:pPr>
-      <w:r>
-        <w:t xml:space="preserve">Neurological recovery requires a minimum of six hours of continuous, low-decibel, dark sleep. Without these inputs, the body’s internal homeostasis collapses, triggering the neurobiological stress cascade described in literature. MDI specifications must be derived from these metabolic constants. By defining these parameters mathematically, we establish an empirical, measurable baseline that removes municipal obligations from the realm of subjective political negotiation and grounds them in the objective constraints of human physiology and cellular survival.</w:t>
+        <w:t xml:space="preserve">To operationalize secular natural law within a public utility framework, we must establish quantitative biological metrics for the survival floor. While individual requirements vary by age, sex, body size, and climate, clinical physiology provides median reference ranges for the human homeostatic envelope. As a baseline municipal standard, thermoregulation generally requires an ambient temperature range between 65 and 75 degrees Fahrenheit to minimize the metabolic work of shivering or sweating. The median adult body requires approximately 2.5 liters of clean water and 2200 kilocalories of nutritionally balanced inputs daily to maintain cellular function and prevent cachexia.</w:t>
+      </w:r>
+    </w:p>
+    <w:p>
+      <w:pPr>
+        <w:pStyle w:val="BodyText"/>
+      </w:pPr>
+      <w:r>
+        <w:t xml:space="preserve">Similarly, median neurological recovery requires a baseline of six to eight hours of continuous, low-decibel, dark sleep (Walker, 2017). Without these core inputs, the body’s internal homeostasis collapses, triggering the neurobiological stress cascade described in literature. MDI specifications must be derived from these median metabolic reference ranges. By defining these parameters systematically, this framework proposes a measurable baseline that removes municipal obligations from the realm of subjective political negotiation and grounds them in the objective constraints of human physiology and cellular survival.</w:t>
       </w:r>
     </w:p>
     <w:bookmarkEnd w:id="34"/>
@@ -520,18 +528,18 @@
         <w:pStyle w:val="BodyText"/>
       </w:pPr>
       <w:r>
-        <w:t xml:space="preserve">Nussbaum argues that societies must guarantee basic physical thresholds, defined as Life, Bodily Health, and Bodily Integrity, as a prerequisite for human dignity (Nussbaum, 2011). The MDI model resolves the debate between Nussbaum’s universal list and Sen’s democratic agency by structuring them into a chronological sequence (Crocker, 2008). Phase Zero functions as the Nussbaum Phase, enforcing biological stability and physical safety through clinical environment design. Once biological baselines are restored, the individual transitions to a self-governed Dunbar Pod, the Sen Phase, regaining agency and participating in pod councils. This sequential resolution proves that constitutional justice requires securing basic physiological thresholds before demanding democratic agency.</w:t>
+        <w:t xml:space="preserve">Nussbaum argues that societies must guarantee basic physical thresholds, defined as Life, Bodily Health, and Bodily Integrity, as a prerequisite for human dignity (Nussbaum, 2011). The MDI model resolves the debate between Nussbaum’s universal list and Sen’s democratic agency by structuring them into a chronological sequence (Crocker, 2008). Phase Zero functions as the Nussbaum Phase, enforcing biological stability and physical safety through clinical environment design. Once biological baselines are restored, the individual transitions to a self-governed Dunbar Pod, the Sen Phase, regaining agency and participating in pod councils. This sequential resolution argues that constitutional justice requires securing basic physiological thresholds before demanding democratic agency.</w:t>
       </w:r>
     </w:p>
     <w:bookmarkEnd w:id="35"/>
     <w:bookmarkEnd w:id="36"/>
-    <w:bookmarkStart w:id="40" w:name="findings"/>
+    <w:bookmarkStart w:id="41" w:name="theoretical-implications"/>
     <w:p>
       <w:pPr>
         <w:pStyle w:val="Heading2"/>
       </w:pPr>
       <w:r>
-        <w:t xml:space="preserve">4. Findings</w:t>
+        <w:t xml:space="preserve">4. Theoretical Implications</w:t>
       </w:r>
     </w:p>
     <w:bookmarkStart w:id="37" w:name="X4c2f8908871593b43471e946523418e3125eefe"/>
@@ -548,7 +556,7 @@
         <w:pStyle w:val="FirstParagraph"/>
       </w:pPr>
       <w:r>
-        <w:t xml:space="preserve">Modern political philosophy assumes that participants in the social contract possess intact cognitive agency (Shilling, 2012). By ignoring the physical requirements of biological survival, this assumption remains flawed (Mitchell, 1997). Mainstream policy structures operate on assumptions of intact cognitive agency that contradict what neuroscience confirms about trauma-affected people. Before expecting individuals to fulfill civic responsibilities, civil society must guarantee the material conditions that support biological agency. Failing to provide these survival spaces violates the premise of the social contract.</w:t>
+        <w:t xml:space="preserve">Modern political philosophy assumes that participants in the social contract possess intact cognitive agency (Maritain, 1951). By ignoring the physical requirements of biological survival, this assumption remains flawed. Mainstream policy structures operate on assumptions of intact cognitive agency that contradict what neuroscience confirms about trauma-affected people. Before expecting individuals to fulfill civic responsibilities, civil society must guarantee the material conditions that support biological agency. Failing to provide these survival spaces violates the premise of the social contract.</w:t>
       </w:r>
     </w:p>
     <w:p>
@@ -668,17 +676,59 @@
       </w:r>
     </w:p>
     <w:bookmarkEnd w:id="39"/>
+    <w:bookmarkStart w:id="40" w:name="Xc712383bc45e1f97b238d33b20edee20f9940fc"/>
+    <w:p>
+      <w:pPr>
+        <w:pStyle w:val="Heading3"/>
+      </w:pPr>
+      <w:r>
+        <w:t xml:space="preserve">4.4 Risks of Coercive Intervention and Institutional Abuse</w:t>
+      </w:r>
+    </w:p>
+    <w:p>
+      <w:pPr>
+        <w:pStyle w:val="FirstParagraph"/>
+      </w:pPr>
+      <w:r>
+        <w:t xml:space="preserve">The proposal for compelled clinical stabilization carries significant ethical risks and historical precedent for abuse. Critics from disability rights and civil liberties frameworks correctly argue that institutionalization has historically been deployed as a mechanism of social control rather than clinical care. The mid-twentieth century psychiatric hospital system demonstrated how isolated, closed facilities often result in severe human rights violations, prioritizing societal convenience over patient recovery.</w:t>
+      </w:r>
+    </w:p>
+    <w:p>
+      <w:pPr>
+        <w:pStyle w:val="BodyText"/>
+      </w:pPr>
+      <w:r>
+        <w:t xml:space="preserve">Any model of compelled stabilization must address these legitimate structural risks. Without robust, transparent safeguards, Material Dignity Infrastructure could devolve into a modern iteration of the carceral state. To mitigate these risks, compelled care must be strictly decoupled from the criminal justice system and governed by independent medical oversight.</w:t>
+      </w:r>
+    </w:p>
+    <w:p>
+      <w:pPr>
+        <w:pStyle w:val="BodyText"/>
+      </w:pPr>
+      <w:r>
+        <w:t xml:space="preserve">Under the least-restrictive-alternative doctrine, involuntary stabilization is legally permissible only when all voluntary community-based options have been exhausted and the individual faces imminent biological collapse (Appelbaum, 1994). Guardianship laws must be restructured to function as temporary, specific delegations of medical authority rather than permanent removals of civil rights (Szasz, 1960; Roth, 2001). Disability rights advocates correctly caution that forced care frequently conflates psychiatric variance with physical danger; therefore, confinement must be strictly limited to the duration required to restore biological and cognitive baselines, subject to automatic, recurring judicial review. While the ethical risks of compulsion are severe, they must be weighed against the ongoing, fatal reality of systemic abandonment on the street. A rigorous ethical framework does not ignore the dangers of intervention; it structures the intervention to maximize agency restoration while legally constraining state power.</w:t>
+      </w:r>
+    </w:p>
     <w:bookmarkEnd w:id="40"/>
-    <w:bookmarkStart w:id="45" w:name="discussion"/>
+    <w:bookmarkEnd w:id="41"/>
+    <w:bookmarkStart w:id="46" w:name="X9fd7afb1ec787d4c9f8c93f8a2faba2af18ba38"/>
     <w:p>
       <w:pPr>
         <w:pStyle w:val="Heading2"/>
       </w:pPr>
       <w:r>
-        <w:t xml:space="preserve">5. Discussion</w:t>
-      </w:r>
-    </w:p>
-    <w:bookmarkStart w:id="41" w:name="Xfc6e5ab2a0ae45f514075fdaf0be295d10234a6"/>
+        <w:t xml:space="preserve">5. Discussion: From Normative Theory to Physical Infrastructure</w:t>
+      </w:r>
+    </w:p>
+    <w:p>
+      <w:pPr>
+        <w:pStyle w:val="FirstParagraph"/>
+      </w:pPr>
+      <w:r>
+        <w:t xml:space="preserve">Translating this normative ethical framework into public policy requires specifying the material infrastructure necessary to meet these biological baselines. If the state accepts the moral obligation to guarantee biological stabilization, it must codify that obligation into engineering specifications.</w:t>
+      </w:r>
+    </w:p>
+    <w:bookmarkStart w:id="42" w:name="Xfc6e5ab2a0ae45f514075fdaf0be295d10234a6"/>
     <w:p>
       <w:pPr>
         <w:pStyle w:val="Heading3"/>
@@ -692,7 +742,7 @@
         <w:pStyle w:val="FirstParagraph"/>
       </w:pPr>
       <w:r>
-        <w:t xml:space="preserve">To operationalize biological stabilization, municipalities must deploy standardized, self-sustaining sanitation pods and Vertically Integrated Stabilization Towers (Mitchell, 1997). Operating these installations as permanent public utilities bypasses bureaucratic housing queues (DeVerteuil, 2015). At the point of street contact, universal access to hygiene facilities, sleeping modules, and clinical decompression spaces stabilizes individuals. This infrastructure reduces emergency healthcare expenditures and halts progressive physical decay.</w:t>
+        <w:t xml:space="preserve">To operationalize biological stabilization, municipalities must deploy standardized, self-sustaining sanitation pods and Vertically Integrated Stabilization Towers. Operating these installations as permanent public utilities bypasses bureaucratic housing queues (DeVerteuil, 2015). At the point of street contact, universal access to hygiene facilities, sleeping modules, and clinical decompression spaces stabilizes individuals. This infrastructure reduces emergency healthcare expenditures and halts progressive physical decay.</w:t>
       </w:r>
     </w:p>
     <w:p>
@@ -724,11 +774,11 @@
         <w:pStyle w:val="BodyText"/>
       </w:pPr>
       <w:r>
-        <w:t xml:space="preserve">The concrete slab foundation for each pod must be engineered for seismic stability and rapid deployment. It must include pre-cast utility channels that interface with municipal main lines when available, or support self-contained storage tanks when grid access is absent. The structural frame must withstand a wind load of 120 miles per hour, protecting occupants during severe weather events.</w:t>
-      </w:r>
-    </w:p>
-    <w:bookmarkEnd w:id="41"/>
-    <w:bookmarkStart w:id="42" w:name="Xe5ff830a7200d4fbf3c613417e13cfee7c2f9f6"/>
+        <w:t xml:space="preserve">The concrete slab foundation for each pod must be engineered for seismic stability and rapid deployment. It must include pre-cast utility channels that interface with municipal main lines when available, or support self-contained storage tanks when grid access is absent. The structural frame must withstand a wind load of 120 miles per hour in compliance with ASCE 7-22 structural standards (ASCE, 2022), protecting occupants during severe weather events.</w:t>
+      </w:r>
+    </w:p>
+    <w:bookmarkEnd w:id="42"/>
+    <w:bookmarkStart w:id="43" w:name="Xe5ff830a7200d4fbf3c613417e13cfee7c2f9f6"/>
     <w:p>
       <w:pPr>
         <w:pStyle w:val="Heading3"/>
@@ -766,7 +816,7 @@
         <w:pStyle w:val="BodyText"/>
       </w:pPr>
       <w:r>
-        <w:t xml:space="preserve">The acoustic design must target a maximum ambient noise level of 35 decibels in sleeping areas, employing double-wall construction and acoustic dampening panels to isolate occupants from urban noise. The ventilation system must incorporate high-efficiency particulate air, or HEPA, filtration and provide a minimum of ten outdoor air changes per hour, maintaining high air quality to prevent the spread of airborne pathogens.</w:t>
+        <w:t xml:space="preserve">The acoustic design must target a maximum ambient noise level of 35 decibels in sleeping areas, employing double-wall construction and acoustic dampening panels to isolate occupants from urban noise. The ventilation system must incorporate high-efficiency particulate air, or HEPA, filtration and provide a minimum of ten outdoor air changes per hour in accordance with ASHRAE Standard 62.1 (ASHRAE, 2019), maintaining high air quality to prevent the spread of airborne pathogens.</w:t>
       </w:r>
     </w:p>
     <w:p>
@@ -777,30 +827,30 @@
         <w:t xml:space="preserve">To maintain protection without relying on traditional police presence, the towers must incorporate automated entry vestibules and biometric verification systems. These systems verify the identity of residents and manage access to clinical areas without requiring invasive security personnel. The security design must emphasize architectural solutions, such as clear sightlines and controlled access points, to create a protected environment for both staff and residents.</w:t>
       </w:r>
     </w:p>
-    <w:bookmarkEnd w:id="42"/>
-    <w:bookmarkStart w:id="43" w:name="cost-benefit-analysis-and-public-finance"/>
+    <w:bookmarkEnd w:id="43"/>
+    <w:bookmarkStart w:id="44" w:name="X526f7f2c0239ecba7bd68a89b12318e046d2ff3"/>
     <w:p>
       <w:pPr>
         <w:pStyle w:val="Heading3"/>
       </w:pPr>
       <w:r>
-        <w:t xml:space="preserve">5.3 Cost-Benefit Analysis and Public Finance</w:t>
-      </w:r>
-    </w:p>
-    <w:p>
-      <w:pPr>
-        <w:pStyle w:val="FirstParagraph"/>
-      </w:pPr>
-      <w:r>
-        <w:t xml:space="preserve">Implementing MDI requires significant capital investment, but it represents a highly efficient use of public funds over time. Currently, municipalities spend vast sums on emergency room visits, ambulance runs, police responses, and court appearances to manage unsheltered homelessness. These reactive measures represent a massive financial drain that fails to address the underlying problem.</w:t>
-      </w:r>
-    </w:p>
-    <w:p>
-      <w:pPr>
-        <w:pStyle w:val="BodyText"/>
-      </w:pPr>
-      <w:r>
-        <w:t xml:space="preserve">By providing immediate physical stabilization, MDI prevents the acute medical crises that lead to emergency room visits. Standardized sanitation reduces the spread of infectious diseases, and protected sleep environments decrease the incidence of assault and physical trauma. Our fiscal model projects that every dollar invested in preventative MDI saves three dollars in municipal emergency expenditure.</w:t>
+        <w:t xml:space="preserve">5.3 Projected Theoretical Efficiencies and Public Finance</w:t>
+      </w:r>
+    </w:p>
+    <w:p>
+      <w:pPr>
+        <w:pStyle w:val="FirstParagraph"/>
+      </w:pPr>
+      <w:r>
+        <w:t xml:space="preserve">Implementing MDI requires significant capital investment. While formal empirical cost-benefit analyses remain outstanding, the framework projects high theoretical efficiencies over time. Currently, municipalities spend vast sums on emergency room visits, ambulance runs, police responses, and court appearances to manage unsheltered homelessness. These reactive measures represent a massive financial drain that fails to address the underlying problem.</w:t>
+      </w:r>
+    </w:p>
+    <w:p>
+      <w:pPr>
+        <w:pStyle w:val="BodyText"/>
+      </w:pPr>
+      <w:r>
+        <w:t xml:space="preserve">By providing immediate physical stabilization, MDI theoretically prevents the acute medical crises that lead to emergency room visits. Standardized sanitation reduces the vectors for infectious diseases, and protected sleep environments decrease the incidence of assault and physical trauma, projecting long-term reductions in municipal service loads.</w:t>
       </w:r>
     </w:p>
     <w:p>
@@ -827,8 +877,8 @@
         <w:t xml:space="preserve">To implement this model, municipalities must establish partnerships with private healthcare networks. These networks, which bear the financial burden of uncompensated emergency care, have an incentive to fund stabilization infrastructure. By contributing to the capital cost of the stabilization towers, private hospitals can reduce their own emergency department expenditures, creating a mutually beneficial funding structure.</w:t>
       </w:r>
     </w:p>
-    <w:bookmarkEnd w:id="43"/>
-    <w:bookmarkStart w:id="44" w:name="comparative-system-analysis"/>
+    <w:bookmarkEnd w:id="44"/>
+    <w:bookmarkStart w:id="45" w:name="comparative-system-analysis"/>
     <w:p>
       <w:pPr>
         <w:pStyle w:val="Heading3"/>
@@ -853,9 +903,9 @@
         <w:t xml:space="preserve">Standalone AOPC rapidly retrofits commercial towers but fails because it lacks the Phase Zero metabolic stabilization layer, placing traumatized brains into independent apartments without addressing their damaged biology. AMFD provides rapid deployment through heavy-duty industrial vehicles but faces high municipal opposition and fails to provide long-term residential stability. TDMZ encounters local zoning battles and lacks the clinical concentration needed for medical delivery. Integrated MDI remains the only structurally complete solution because it synchronizes physical skyscraper conversions with biological triage and localized pod governance, succeeding where partial infrastructure models fail.</w:t>
       </w:r>
     </w:p>
-    <w:bookmarkEnd w:id="44"/>
     <w:bookmarkEnd w:id="45"/>
-    <w:bookmarkStart w:id="48" w:name="conclusion"/>
+    <w:bookmarkEnd w:id="46"/>
+    <w:bookmarkStart w:id="49" w:name="conclusion"/>
     <w:p>
       <w:pPr>
         <w:pStyle w:val="Heading2"/>
@@ -864,7 +914,7 @@
         <w:t xml:space="preserve">6. Conclusion</w:t>
       </w:r>
     </w:p>
-    <w:bookmarkStart w:id="46" w:name="summary-of-the-model-shift"/>
+    <w:bookmarkStart w:id="47" w:name="summary-of-the-model-shift"/>
     <w:p>
       <w:pPr>
         <w:pStyle w:val="Heading3"/>
@@ -878,7 +928,7 @@
         <w:pStyle w:val="FirstParagraph"/>
       </w:pPr>
       <w:r>
-        <w:t xml:space="preserve">Urban design provides the primary mechanism for arresting bodily decay among vulnerable populations (Mitchell, 1997; Westbrook &amp; Robinson, 2021). Before implementing sociological or programmatic interventions, municipalities must restructure public spaces to support physiological stabilization. Engineering survival infrastructure enables municipal authorities to rebuild the fragile material foundations required for human agency and long-term recovery.</w:t>
+        <w:t xml:space="preserve">Urban design provides the primary mechanism for arresting bodily decay among vulnerable populations (Westbrook &amp; Robinson, 2021). Before implementing sociological or programmatic interventions, municipalities must restructure public spaces to support physiological stabilization. Engineering survival infrastructure enables municipal authorities to rebuild the fragile material foundations required for human agency and long-term recovery.</w:t>
       </w:r>
     </w:p>
     <w:p>
@@ -905,8 +955,8 @@
         <w:t xml:space="preserve">This model shift requires a rejection of the voluntaristic housing models that dominate modern social policy. We must accept that when an individual’s cognitive agency has collapsed, the municipal government has a positive obligation to intervene, stabilize, and rebuild that agency. This commitment must be operationalized through permanent, standardized public infrastructure.</w:t>
       </w:r>
     </w:p>
-    <w:bookmarkEnd w:id="46"/>
-    <w:bookmarkStart w:id="47" w:name="future-research-directions"/>
+    <w:bookmarkEnd w:id="47"/>
+    <w:bookmarkStart w:id="48" w:name="future-research-directions"/>
     <w:p>
       <w:pPr>
         <w:pStyle w:val="Heading3"/>
@@ -947,9 +997,9 @@
         <w:t xml:space="preserve">The goal of this research is to establish design guidelines that make extreme precarity impossible. By engineering the city to support human biology, we can guarantee that the physical prerequisites of agency are protected for all, fulfilling the moral obligations of a civilized society.</w:t>
       </w:r>
     </w:p>
-    <w:bookmarkEnd w:id="47"/>
     <w:bookmarkEnd w:id="48"/>
-    <w:bookmarkStart w:id="52" w:name="declarations"/>
+    <w:bookmarkEnd w:id="49"/>
+    <w:bookmarkStart w:id="53" w:name="declarations"/>
     <w:p>
       <w:pPr>
         <w:pStyle w:val="Heading2"/>
@@ -958,7 +1008,7 @@
         <w:t xml:space="preserve">Declarations</w:t>
       </w:r>
     </w:p>
-    <w:bookmarkStart w:id="49" w:name="funding"/>
+    <w:bookmarkStart w:id="50" w:name="funding"/>
     <w:p>
       <w:pPr>
         <w:pStyle w:val="Heading3"/>
@@ -975,8 +1025,8 @@
         <w:t xml:space="preserve">This work received no grant from any funding agency in the public, commercial, or not-for-profit sectors.</w:t>
       </w:r>
     </w:p>
-    <w:bookmarkEnd w:id="49"/>
-    <w:bookmarkStart w:id="50" w:name="disclosure-statement"/>
+    <w:bookmarkEnd w:id="50"/>
+    <w:bookmarkStart w:id="51" w:name="disclosure-statement"/>
     <w:p>
       <w:pPr>
         <w:pStyle w:val="Heading3"/>
@@ -993,8 +1043,8 @@
         <w:t xml:space="preserve">No potential conflict of interest was reported by the authors.</w:t>
       </w:r>
     </w:p>
-    <w:bookmarkEnd w:id="50"/>
-    <w:bookmarkStart w:id="51" w:name="data-availability-statement"/>
+    <w:bookmarkEnd w:id="51"/>
+    <w:bookmarkStart w:id="52" w:name="data-availability-statement"/>
     <w:p>
       <w:pPr>
         <w:pStyle w:val="Heading3"/>
@@ -1011,9 +1061,9 @@
         <w:t xml:space="preserve">Data sharing is not applicable to this article as no new datasets were created or analyzed.</w:t>
       </w:r>
     </w:p>
-    <w:bookmarkEnd w:id="51"/>
     <w:bookmarkEnd w:id="52"/>
-    <w:bookmarkStart w:id="53" w:name="references"/>
+    <w:bookmarkEnd w:id="53"/>
+    <w:bookmarkStart w:id="54" w:name="references"/>
     <w:p>
       <w:pPr>
         <w:pStyle w:val="Heading2"/>
@@ -1025,6 +1075,159 @@
     <w:p>
       <w:pPr>
         <w:pStyle w:val="FirstParagraph"/>
+      </w:pPr>
+      <w:r>
+        <w:t xml:space="preserve">Appelbaum, P. S. (1994).</w:t>
+      </w:r>
+      <w:r>
+        <w:t xml:space="preserve"> </w:t>
+      </w:r>
+      <w:r>
+        <w:rPr>
+          <w:iCs/>
+          <w:i/>
+        </w:rPr>
+        <w:t xml:space="preserve">Almost a revolution: Mental health law and the limits of change</w:t>
+      </w:r>
+      <w:r>
+        <w:t xml:space="preserve">. Oxford University Press.</w:t>
+      </w:r>
+    </w:p>
+    <w:p>
+      <w:pPr>
+        <w:pStyle w:val="BodyText"/>
+      </w:pPr>
+      <w:r>
+        <w:t xml:space="preserve">Aravena, A. (2016).</w:t>
+      </w:r>
+      <w:r>
+        <w:t xml:space="preserve"> </w:t>
+      </w:r>
+      <w:r>
+        <w:rPr>
+          <w:iCs/>
+          <w:i/>
+        </w:rPr>
+        <w:t xml:space="preserve">Elemental: Incremental housing and participatory design manual</w:t>
+      </w:r>
+      <w:r>
+        <w:t xml:space="preserve">. Hatje Cantz.</w:t>
+      </w:r>
+    </w:p>
+    <w:p>
+      <w:pPr>
+        <w:pStyle w:val="BodyText"/>
+      </w:pPr>
+      <w:r>
+        <w:t xml:space="preserve">Arnsten, A. F. (2009). Stress signalling pathways that impair prefrontal cortex structure and function.</w:t>
+      </w:r>
+      <w:r>
+        <w:t xml:space="preserve"> </w:t>
+      </w:r>
+      <w:r>
+        <w:rPr>
+          <w:iCs/>
+          <w:i/>
+        </w:rPr>
+        <w:t xml:space="preserve">Nature Reviews Neuroscience</w:t>
+      </w:r>
+      <w:r>
+        <w:t xml:space="preserve">, 10(6), 410-422.</w:t>
+      </w:r>
+    </w:p>
+    <w:p>
+      <w:pPr>
+        <w:pStyle w:val="BodyText"/>
+      </w:pPr>
+      <w:r>
+        <w:t xml:space="preserve">ASCE. (2022).</w:t>
+      </w:r>
+      <w:r>
+        <w:t xml:space="preserve"> </w:t>
+      </w:r>
+      <w:r>
+        <w:rPr>
+          <w:iCs/>
+          <w:i/>
+        </w:rPr>
+        <w:t xml:space="preserve">Minimum design loads and associated criteria for buildings and other structures</w:t>
+      </w:r>
+      <w:r>
+        <w:t xml:space="preserve"> </w:t>
+      </w:r>
+      <w:r>
+        <w:t xml:space="preserve">(ASCE/SEI 7-22). American Society of Civil Engineers.</w:t>
+      </w:r>
+    </w:p>
+    <w:p>
+      <w:pPr>
+        <w:pStyle w:val="BodyText"/>
+      </w:pPr>
+      <w:r>
+        <w:t xml:space="preserve">ASHRAE. (2019).</w:t>
+      </w:r>
+      <w:r>
+        <w:t xml:space="preserve"> </w:t>
+      </w:r>
+      <w:r>
+        <w:rPr>
+          <w:iCs/>
+          <w:i/>
+        </w:rPr>
+        <w:t xml:space="preserve">Ventilation for acceptable indoor air quality</w:t>
+      </w:r>
+      <w:r>
+        <w:t xml:space="preserve"> </w:t>
+      </w:r>
+      <w:r>
+        <w:t xml:space="preserve">(Standard 62.1-2019). American Society of Heating, Refrigerating and Air-Conditioning Engineers.</w:t>
+      </w:r>
+    </w:p>
+    <w:p>
+      <w:pPr>
+        <w:pStyle w:val="BodyText"/>
+      </w:pPr>
+      <w:r>
+        <w:t xml:space="preserve">Batterham, D. (2020). Homelessness as capability deprivation: A conceptual model.</w:t>
+      </w:r>
+      <w:r>
+        <w:t xml:space="preserve"> </w:t>
+      </w:r>
+      <w:r>
+        <w:rPr>
+          <w:iCs/>
+          <w:i/>
+        </w:rPr>
+        <w:t xml:space="preserve">Housing, Theory and Society</w:t>
+      </w:r>
+      <w:r>
+        <w:t xml:space="preserve">, 37(3), 274-297.</w:t>
+      </w:r>
+    </w:p>
+    <w:p>
+      <w:pPr>
+        <w:pStyle w:val="BodyText"/>
+      </w:pPr>
+      <w:r>
+        <w:t xml:space="preserve">Crocker, D. A. (2008).</w:t>
+      </w:r>
+      <w:r>
+        <w:t xml:space="preserve"> </w:t>
+      </w:r>
+      <w:r>
+        <w:rPr>
+          <w:iCs/>
+          <w:i/>
+        </w:rPr>
+        <w:t xml:space="preserve">Ethics of global development: Agency, capability, and deliberative democracy</w:t>
+      </w:r>
+      <w:r>
+        <w:t xml:space="preserve">. Cambridge University Press.</w:t>
+      </w:r>
+    </w:p>
+    <w:p>
+      <w:pPr>
+        <w:pStyle w:val="BodyText"/>
       </w:pPr>
       <w:r>
         <w:t xml:space="preserve">DeVerteuil, G. (2015).</w:t>
@@ -1069,6 +1272,48 @@
         <w:pStyle w:val="BodyText"/>
       </w:pPr>
       <w:r>
+        <w:t xml:space="preserve">Maritain, J. (1951).</w:t>
+      </w:r>
+      <w:r>
+        <w:t xml:space="preserve"> </w:t>
+      </w:r>
+      <w:r>
+        <w:rPr>
+          <w:iCs/>
+          <w:i/>
+        </w:rPr>
+        <w:t xml:space="preserve">Man and the state</w:t>
+      </w:r>
+      <w:r>
+        <w:t xml:space="preserve">. University of Chicago Press.</w:t>
+      </w:r>
+    </w:p>
+    <w:p>
+      <w:pPr>
+        <w:pStyle w:val="BodyText"/>
+      </w:pPr>
+      <w:r>
+        <w:t xml:space="preserve">McEwen, B. S. (2017). Neurobiological and systemic effects of chronic stress.</w:t>
+      </w:r>
+      <w:r>
+        <w:t xml:space="preserve"> </w:t>
+      </w:r>
+      <w:r>
+        <w:rPr>
+          <w:iCs/>
+          <w:i/>
+        </w:rPr>
+        <w:t xml:space="preserve">Chronic Stress</w:t>
+      </w:r>
+      <w:r>
+        <w:t xml:space="preserve">, 1.</w:t>
+      </w:r>
+    </w:p>
+    <w:p>
+      <w:pPr>
+        <w:pStyle w:val="BodyText"/>
+      </w:pPr>
+      <w:r>
         <w:t xml:space="preserve">Mitchell, D. (1997). The annihilation of space by law: The anti-homeless laws and the shrinking of public space in American cities.</w:t>
       </w:r>
       <w:r>
@@ -1090,7 +1335,7 @@
         <w:pStyle w:val="BodyText"/>
       </w:pPr>
       <w:r>
-        <w:t xml:space="preserve">Shilling, C. (2012).</w:t>
+        <w:t xml:space="preserve">Nussbaum, M. C. (2011).</w:t>
       </w:r>
       <w:r>
         <w:t xml:space="preserve"> </w:t>
@@ -1100,13 +1345,94 @@
           <w:iCs/>
           <w:i/>
         </w:rPr>
-        <w:t xml:space="preserve">The body and social theory</w:t>
+        <w:t xml:space="preserve">Creating capabilities: The human development approach</w:t>
+      </w:r>
+      <w:r>
+        <w:t xml:space="preserve">. Harvard University Press.</w:t>
+      </w:r>
+    </w:p>
+    <w:p>
+      <w:pPr>
+        <w:pStyle w:val="BodyText"/>
+      </w:pPr>
+      <w:r>
+        <w:t xml:space="preserve">Roth, M. (2001). Guardianship and the least restrictive alternative.</w:t>
       </w:r>
       <w:r>
         <w:t xml:space="preserve"> </w:t>
       </w:r>
       <w:r>
-        <w:t xml:space="preserve">(3rd ed.). SAGE Publications.</w:t>
+        <w:rPr>
+          <w:iCs/>
+          <w:i/>
+        </w:rPr>
+        <w:t xml:space="preserve">Journal of Health Politics, Policy and Law</w:t>
+      </w:r>
+      <w:r>
+        <w:t xml:space="preserve">, 26(3), 603-625.</w:t>
+      </w:r>
+    </w:p>
+    <w:p>
+      <w:pPr>
+        <w:pStyle w:val="BodyText"/>
+      </w:pPr>
+      <w:r>
+        <w:t xml:space="preserve">Sapolsky, R. M. (2004).</w:t>
+      </w:r>
+      <w:r>
+        <w:t xml:space="preserve"> </w:t>
+      </w:r>
+      <w:r>
+        <w:rPr>
+          <w:iCs/>
+          <w:i/>
+        </w:rPr>
+        <w:t xml:space="preserve">Why zebras don’t get ulcers</w:t>
+      </w:r>
+      <w:r>
+        <w:t xml:space="preserve">. Holt Paperbacks.</w:t>
+      </w:r>
+    </w:p>
+    <w:p>
+      <w:pPr>
+        <w:pStyle w:val="BodyText"/>
+      </w:pPr>
+      <w:r>
+        <w:t xml:space="preserve">Sen, A. (1999).</w:t>
+      </w:r>
+      <w:r>
+        <w:t xml:space="preserve"> </w:t>
+      </w:r>
+      <w:r>
+        <w:rPr>
+          <w:iCs/>
+          <w:i/>
+        </w:rPr>
+        <w:t xml:space="preserve">Development as freedom</w:t>
+      </w:r>
+      <w:r>
+        <w:t xml:space="preserve">. Oxford University Press.</w:t>
+      </w:r>
+    </w:p>
+    <w:p>
+      <w:pPr>
+        <w:pStyle w:val="BodyText"/>
+      </w:pPr>
+      <w:r>
+        <w:t xml:space="preserve">Szasz, T. S. (1960). The myth of mental illness.</w:t>
+      </w:r>
+      <w:r>
+        <w:t xml:space="preserve"> </w:t>
+      </w:r>
+      <w:r>
+        <w:rPr>
+          <w:iCs/>
+          <w:i/>
+        </w:rPr>
+        <w:t xml:space="preserve">American Psychologist</w:t>
+      </w:r>
+      <w:r>
+        <w:t xml:space="preserve">, 15(2), 113-118.</w:t>
       </w:r>
     </w:p>
     <w:p>
@@ -1135,7 +1461,7 @@
         <w:pStyle w:val="BodyText"/>
       </w:pPr>
       <w:r>
-        <w:t xml:space="preserve">Aravena, A. (2016).</w:t>
+        <w:t xml:space="preserve">Walker, M. (2017).</w:t>
       </w:r>
       <w:r>
         <w:t xml:space="preserve"> </w:t>
@@ -1145,115 +1471,10 @@
           <w:iCs/>
           <w:i/>
         </w:rPr>
-        <w:t xml:space="preserve">Elemental: Incremental housing and participatory design manual</w:t>
-      </w:r>
-      <w:r>
-        <w:t xml:space="preserve">. Hatje Cantz.</w:t>
-      </w:r>
-    </w:p>
-    <w:p>
-      <w:pPr>
-        <w:pStyle w:val="BodyText"/>
-      </w:pPr>
-      <w:r>
-        <w:t xml:space="preserve">Batterham, D. (2020). Homelessness as capability deprivation: A conceptual model.</w:t>
-      </w:r>
-      <w:r>
-        <w:t xml:space="preserve"> </w:t>
-      </w:r>
-      <w:r>
-        <w:rPr>
-          <w:iCs/>
-          <w:i/>
-        </w:rPr>
-        <w:t xml:space="preserve">Housing, Theory and Society</w:t>
-      </w:r>
-      <w:r>
-        <w:t xml:space="preserve">, 37(3), 274-297.</w:t>
-      </w:r>
-    </w:p>
-    <w:p>
-      <w:pPr>
-        <w:pStyle w:val="BodyText"/>
-      </w:pPr>
-      <w:r>
-        <w:t xml:space="preserve">Crocker, D. A. (2008).</w:t>
-      </w:r>
-      <w:r>
-        <w:t xml:space="preserve"> </w:t>
-      </w:r>
-      <w:r>
-        <w:rPr>
-          <w:iCs/>
-          <w:i/>
-        </w:rPr>
-        <w:t xml:space="preserve">Ethics of global development: Agency, capability, and deliberative democracy</w:t>
-      </w:r>
-      <w:r>
-        <w:t xml:space="preserve">. Cambridge University Press.</w:t>
-      </w:r>
-    </w:p>
-    <w:p>
-      <w:pPr>
-        <w:pStyle w:val="BodyText"/>
-      </w:pPr>
-      <w:r>
-        <w:t xml:space="preserve">Nussbaum, M. C. (2011).</w:t>
-      </w:r>
-      <w:r>
-        <w:t xml:space="preserve"> </w:t>
-      </w:r>
-      <w:r>
-        <w:rPr>
-          <w:iCs/>
-          <w:i/>
-        </w:rPr>
-        <w:t xml:space="preserve">Creating capabilities: The human development approach</w:t>
-      </w:r>
-      <w:r>
-        <w:t xml:space="preserve">. Harvard University Press.</w:t>
-      </w:r>
-    </w:p>
-    <w:p>
-      <w:pPr>
-        <w:pStyle w:val="BodyText"/>
-      </w:pPr>
-      <w:r>
-        <w:t xml:space="preserve">Sen, A. (1999).</w:t>
-      </w:r>
-      <w:r>
-        <w:t xml:space="preserve"> </w:t>
-      </w:r>
-      <w:r>
-        <w:rPr>
-          <w:iCs/>
-          <w:i/>
-        </w:rPr>
-        <w:t xml:space="preserve">Development as freedom</w:t>
-      </w:r>
-      <w:r>
-        <w:t xml:space="preserve">. Oxford University Press.</w:t>
-      </w:r>
-    </w:p>
-    <w:p>
-      <w:pPr>
-        <w:pStyle w:val="BodyText"/>
-      </w:pPr>
-      <w:r>
-        <w:t xml:space="preserve">Shopworks Architecture. (2024).</w:t>
-      </w:r>
-      <w:r>
-        <w:t xml:space="preserve"> </w:t>
-      </w:r>
-      <w:r>
-        <w:rPr>
-          <w:iCs/>
-          <w:i/>
-        </w:rPr>
-        <w:t xml:space="preserve">Trauma-informed design in supportive housing: Physical environments and nervous system regulation</w:t>
-      </w:r>
-      <w:r>
-        <w:t xml:space="preserve">. Shopworks.</w:t>
+        <w:t xml:space="preserve">Why we sleep: Unlocking the power of sleep and dreams</w:t>
+      </w:r>
+      <w:r>
+        <w:t xml:space="preserve">. Simon and Schuster.</w:t>
       </w:r>
     </w:p>
     <w:p>
@@ -1277,8 +1498,8 @@
         <w:t xml:space="preserve">, 30(2), 107–115.</w:t>
       </w:r>
     </w:p>
-    <w:bookmarkEnd w:id="53"/>
     <w:bookmarkEnd w:id="54"/>
+    <w:bookmarkEnd w:id="55"/>
     <w:sectPr/>
   </w:body>
 </w:document>

</xml_diff>

<commit_message>
feat(jsdh): integrate Section 6 Anticipated Objections defense module
</commit_message>
<xml_diff>
--- a/networking/jsdh/Manuscript_Anonymous.docx
+++ b/networking/jsdh/Manuscript_Anonymous.docx
@@ -2,7 +2,7 @@
 <file path=word/document.xml><?xml version="1.0" encoding="utf-8"?>
 <w:document xmlns:w="http://schemas.openxmlformats.org/wordprocessingml/2006/main" xmlns:m="http://schemas.openxmlformats.org/officeDocument/2006/math" xmlns:r="http://schemas.openxmlformats.org/officeDocument/2006/relationships" xmlns:o="urn:schemas-microsoft-com:office:office" xmlns:v="urn:schemas-microsoft-com:vml" xmlns:w10="urn:schemas-microsoft-com:office:word" xmlns:a="http://schemas.openxmlformats.org/drawingml/2006/main" xmlns:pic="http://schemas.openxmlformats.org/drawingml/2006/picture" xmlns:wp="http://schemas.openxmlformats.org/drawingml/2006/wordprocessingDrawing">
   <w:body>
-    <w:bookmarkStart w:id="55" w:name="the-moral-physics-of-survival"/>
+    <w:bookmarkStart w:id="64" w:name="the-moral-physics-of-survival"/>
     <w:p>
       <w:pPr>
         <w:pStyle w:val="Heading1"/>
@@ -905,179 +905,52 @@
     </w:p>
     <w:bookmarkEnd w:id="45"/>
     <w:bookmarkEnd w:id="46"/>
-    <w:bookmarkStart w:id="49" w:name="conclusion"/>
+    <w:bookmarkStart w:id="55" w:name="Xa30a2fe7a1d6246103c5fdeb305b8920b271ff7"/>
     <w:p>
       <w:pPr>
         <w:pStyle w:val="Heading2"/>
       </w:pPr>
       <w:r>
-        <w:t xml:space="preserve">6. Conclusion</w:t>
-      </w:r>
-    </w:p>
-    <w:bookmarkStart w:id="47" w:name="summary-of-the-model-shift"/>
-    <w:p>
-      <w:pPr>
-        <w:pStyle w:val="Heading3"/>
-      </w:pPr>
-      <w:r>
-        <w:t xml:space="preserve">6.1 Summary of the Model Shift</w:t>
-      </w:r>
-    </w:p>
-    <w:p>
-      <w:pPr>
-        <w:pStyle w:val="FirstParagraph"/>
-      </w:pPr>
-      <w:r>
-        <w:t xml:space="preserve">Urban design provides the primary mechanism for arresting bodily decay among vulnerable populations (Westbrook &amp; Robinson, 2021). Before implementing sociological or programmatic interventions, municipalities must restructure public spaces to support physiological stabilization. Engineering survival infrastructure enables municipal authorities to rebuild the fragile material foundations required for human agency and long-term recovery.</w:t>
-      </w:r>
-    </w:p>
-    <w:p>
-      <w:pPr>
-        <w:pStyle w:val="BodyText"/>
-      </w:pPr>
-      <w:r>
-        <w:t xml:space="preserve">The current municipal approach to homelessness is a structural failure disguised as a social problem. By demanding programmatic compliance from individuals whose cognitive capacity has been dismantled by environmental trauma, cities guarantee the failure of their own programs. We must recognize that the body’s physical integrity is the prerequisite for any form of social or economic recovery.</w:t>
-      </w:r>
-    </w:p>
-    <w:p>
-      <w:pPr>
-        <w:pStyle w:val="BodyText"/>
-      </w:pPr>
-      <w:r>
-        <w:t xml:space="preserve">To build a humane and rational city, we must treat the physical environment as a moral variable. The design of our public spaces must reflect an understanding of human biology and thermodynamic needs. By deploying MDI and establishing a biological floor, we can halt the progressive decay of our most vulnerable citizens, rebuilding the material foundations of the social contract.</w:t>
-      </w:r>
-    </w:p>
-    <w:p>
-      <w:pPr>
-        <w:pStyle w:val="BodyText"/>
-      </w:pPr>
-      <w:r>
-        <w:t xml:space="preserve">This model shift requires a rejection of the voluntaristic housing models that dominate modern social policy. We must accept that when an individual’s cognitive agency has collapsed, the municipal government has a positive obligation to intervene, stabilize, and rebuild that agency. This commitment must be operationalized through permanent, standardized public infrastructure.</w:t>
-      </w:r>
-    </w:p>
-    <w:bookmarkEnd w:id="47"/>
-    <w:bookmarkStart w:id="48" w:name="future-research-directions"/>
-    <w:p>
-      <w:pPr>
-        <w:pStyle w:val="Heading3"/>
-      </w:pPr>
-      <w:r>
-        <w:t xml:space="preserve">6.2 Future Research Directions</w:t>
-      </w:r>
-    </w:p>
-    <w:p>
-      <w:pPr>
-        <w:pStyle w:val="FirstParagraph"/>
-      </w:pPr>
-      <w:r>
-        <w:t xml:space="preserve">The integration of neurobiology, thermodynamics, and urban planning represents a new field of study for social policy. Future research must focus on measuring the precise cognitive and physiological impacts of different physical environments. By conducting longitudinal studies of individuals in MDI installations, researchers can refine the engineering specifications for stabilization infrastructure.</w:t>
-      </w:r>
-    </w:p>
-    <w:p>
-      <w:pPr>
-        <w:pStyle w:val="BodyText"/>
-      </w:pPr>
-      <w:r>
-        <w:t xml:space="preserve">To measure these effects, researchers must track biomarkers of chronic stress, including cortisol and inflammatory cytokines, before and after placement in stabilization towers. Cognitive testing must evaluate changes in executive functioning, working memory, and decision-making capacity over time, documenting the rate of neurological recovery.</w:t>
-      </w:r>
-    </w:p>
-    <w:p>
-      <w:pPr>
-        <w:pStyle w:val="BodyText"/>
-      </w:pPr>
-      <w:r>
-        <w:t xml:space="preserve">Economists must develop broader models for evaluating the long-term fiscal benefits of preventative infrastructure. These models must account for the indirect savings in emergency healthcare, public protection, and tourism revenue. By demonstrating the long-term financial viability of MDI, social scientists and economists can collaborate to build the broad political and civic consensus necessary for large-scale municipal deployment across urban centers.</w:t>
-      </w:r>
-    </w:p>
-    <w:p>
-      <w:pPr>
-        <w:pStyle w:val="BodyText"/>
-      </w:pPr>
-      <w:r>
-        <w:t xml:space="preserve">The goal of this research is to establish design guidelines that make extreme precarity impossible. By engineering the city to support human biology, we can guarantee that the physical prerequisites of agency are protected for all, fulfilling the moral obligations of a civilized society.</w:t>
-      </w:r>
-    </w:p>
-    <w:bookmarkEnd w:id="48"/>
-    <w:bookmarkEnd w:id="49"/>
-    <w:bookmarkStart w:id="53" w:name="declarations"/>
-    <w:p>
-      <w:pPr>
-        <w:pStyle w:val="Heading2"/>
-      </w:pPr>
-      <w:r>
-        <w:t xml:space="preserve">Declarations</w:t>
-      </w:r>
-    </w:p>
-    <w:bookmarkStart w:id="50" w:name="funding"/>
-    <w:p>
-      <w:pPr>
-        <w:pStyle w:val="Heading3"/>
-      </w:pPr>
-      <w:r>
-        <w:t xml:space="preserve">Funding</w:t>
-      </w:r>
-    </w:p>
-    <w:p>
-      <w:pPr>
-        <w:pStyle w:val="FirstParagraph"/>
-      </w:pPr>
-      <w:r>
-        <w:t xml:space="preserve">This work received no grant from any funding agency in the public, commercial, or not-for-profit sectors.</w:t>
-      </w:r>
-    </w:p>
-    <w:bookmarkEnd w:id="50"/>
-    <w:bookmarkStart w:id="51" w:name="disclosure-statement"/>
-    <w:p>
-      <w:pPr>
-        <w:pStyle w:val="Heading3"/>
-      </w:pPr>
-      <w:r>
-        <w:t xml:space="preserve">Disclosure Statement</w:t>
-      </w:r>
-    </w:p>
-    <w:p>
-      <w:pPr>
-        <w:pStyle w:val="FirstParagraph"/>
-      </w:pPr>
-      <w:r>
-        <w:t xml:space="preserve">No potential conflict of interest was reported by the authors.</w:t>
-      </w:r>
-    </w:p>
-    <w:bookmarkEnd w:id="51"/>
-    <w:bookmarkStart w:id="52" w:name="data-availability-statement"/>
-    <w:p>
-      <w:pPr>
-        <w:pStyle w:val="Heading3"/>
-      </w:pPr>
-      <w:r>
-        <w:t xml:space="preserve">Data Availability Statement</w:t>
-      </w:r>
-    </w:p>
-    <w:p>
-      <w:pPr>
-        <w:pStyle w:val="FirstParagraph"/>
-      </w:pPr>
-      <w:r>
-        <w:t xml:space="preserve">Data sharing is not applicable to this article as no new datasets were created or analyzed.</w:t>
-      </w:r>
-    </w:p>
-    <w:bookmarkEnd w:id="52"/>
-    <w:bookmarkEnd w:id="53"/>
-    <w:bookmarkStart w:id="54" w:name="references"/>
-    <w:p>
-      <w:pPr>
-        <w:pStyle w:val="Heading2"/>
-      </w:pPr>
-      <w:r>
-        <w:t xml:space="preserve">References</w:t>
-      </w:r>
-    </w:p>
-    <w:p>
-      <w:pPr>
-        <w:pStyle w:val="FirstParagraph"/>
-      </w:pPr>
-      <w:r>
-        <w:t xml:space="preserve">Appelbaum, P. S. (1994).</w:t>
+        <w:t xml:space="preserve">6. Anticipated Objections to the MDI Structure</w:t>
+      </w:r>
+    </w:p>
+    <w:bookmarkStart w:id="47" w:name="the-technocratic-authoritarian-fallacy"/>
+    <w:p>
+      <w:pPr>
+        <w:pStyle w:val="Heading3"/>
+      </w:pPr>
+      <w:r>
+        <w:t xml:space="preserve">6.1 The Technocratic Authoritarian Fallacy</w:t>
+      </w:r>
+    </w:p>
+    <w:p>
+      <w:pPr>
+        <w:pStyle w:val="FirstParagraph"/>
+      </w:pPr>
+      <w:r>
+        <w:rPr>
+          <w:bCs/>
+          <w:b/>
+        </w:rPr>
+        <w:t xml:space="preserve">Objection</w:t>
+      </w:r>
+      <w:r>
+        <w:t xml:space="preserve">: MDI represents an expansion of the carceral state, using medicalized infrastructure to enforce universal social control and strip individuals of civil liberties through compelled care.</w:t>
+      </w:r>
+    </w:p>
+    <w:p>
+      <w:pPr>
+        <w:pStyle w:val="BodyText"/>
+      </w:pPr>
+      <w:r>
+        <w:rPr>
+          <w:bCs/>
+          <w:b/>
+        </w:rPr>
+        <w:t xml:space="preserve">Error Vector</w:t>
+      </w:r>
+      <w:r>
+        <w:t xml:space="preserve">:</w:t>
       </w:r>
       <w:r>
         <w:t xml:space="preserve"> </w:t>
@@ -1087,18 +960,53 @@
           <w:iCs/>
           <w:i/>
         </w:rPr>
-        <w:t xml:space="preserve">Almost a revolution: Mental health law and the limits of change</w:t>
-      </w:r>
-      <w:r>
-        <w:t xml:space="preserve">. Oxford University Press.</w:t>
-      </w:r>
-    </w:p>
-    <w:p>
-      <w:pPr>
-        <w:pStyle w:val="BodyText"/>
-      </w:pPr>
-      <w:r>
-        <w:t xml:space="preserve">Aravena, A. (2016).</w:t>
+        <w:t xml:space="preserve">Blurring Cohorts and Misapplying Liberty</w:t>
+      </w:r>
+      <w:r>
+        <w:t xml:space="preserve"> </w:t>
+      </w:r>
+      <w:r>
+        <w:t xml:space="preserve">This objection ignores the boundary condition of the MDI structure: compulsion applies only when biological and cognitive agency collapses below the objective thermodynamic survival threshold. It conflates individuals suffering from temporary economic displacement with those experiencing chronic physiological collapse. By assuming intact cognitive agency where neurobiological degradation (e.g., cortisol toxicity, executive dysfunction) has occurred, this critique prioritizes the theoretical aesthetic of negative liberty over the physical reality of biological survival.</w:t>
+      </w:r>
+    </w:p>
+    <w:bookmarkEnd w:id="47"/>
+    <w:bookmarkStart w:id="48" w:name="the-housing-reductionist-fallacy"/>
+    <w:p>
+      <w:pPr>
+        <w:pStyle w:val="Heading3"/>
+      </w:pPr>
+      <w:r>
+        <w:t xml:space="preserve">6.2 The Housing-Reductionist Fallacy</w:t>
+      </w:r>
+    </w:p>
+    <w:p>
+      <w:pPr>
+        <w:pStyle w:val="FirstParagraph"/>
+      </w:pPr>
+      <w:r>
+        <w:rPr>
+          <w:bCs/>
+          <w:b/>
+        </w:rPr>
+        <w:t xml:space="preserve">Objection</w:t>
+      </w:r>
+      <w:r>
+        <w:t xml:space="preserve">: The crisis requires permanent residential apartments (Housing First), not medicalized, clinical-housing infrastructure or stabilization towers.</w:t>
+      </w:r>
+    </w:p>
+    <w:p>
+      <w:pPr>
+        <w:pStyle w:val="BodyText"/>
+      </w:pPr>
+      <w:r>
+        <w:rPr>
+          <w:bCs/>
+          <w:b/>
+        </w:rPr>
+        <w:t xml:space="preserve">Error Vector</w:t>
+      </w:r>
+      <w:r>
+        <w:t xml:space="preserve">:</w:t>
       </w:r>
       <w:r>
         <w:t xml:space="preserve"> </w:t>
@@ -1108,18 +1016,71 @@
           <w:iCs/>
           <w:i/>
         </w:rPr>
-        <w:t xml:space="preserve">Elemental: Incremental housing and participatory design manual</w:t>
-      </w:r>
-      <w:r>
-        <w:t xml:space="preserve">. Hatje Cantz.</w:t>
-      </w:r>
-    </w:p>
-    <w:p>
-      <w:pPr>
-        <w:pStyle w:val="BodyText"/>
-      </w:pPr>
-      <w:r>
-        <w:t xml:space="preserve">Arnsten, A. F. (2009). Stress signalling pathways that impair prefrontal cortex structure and function.</w:t>
+        <w:t xml:space="preserve">Misapplying Interventions</w:t>
+      </w:r>
+      <w:r>
+        <w:t xml:space="preserve"> </w:t>
+      </w:r>
+      <w:r>
+        <w:t xml:space="preserve">This objection applies unstructured independent housing to a neurobiological emergency. Placing a traumatized, sleep-deprived brain suffering from profound HPA-axis dysregulation into an isolated apartment without immediate, managed metabolic stabilization bypasses the required Phase Zero triage. The housing-reductionist fallacy incorrectly assumes that physical shelter automatically restores dismantled prefrontal cortex function.</w:t>
+      </w:r>
+    </w:p>
+    <w:bookmarkEnd w:id="48"/>
+    <w:bookmarkStart w:id="49" w:name="the-monolithic-cohort-fallacy"/>
+    <w:p>
+      <w:pPr>
+        <w:pStyle w:val="Heading3"/>
+      </w:pPr>
+      <w:r>
+        <w:t xml:space="preserve">6.3 The Monolithic Cohort Fallacy</w:t>
+      </w:r>
+    </w:p>
+    <w:p>
+      <w:pPr>
+        <w:pStyle w:val="FirstParagraph"/>
+      </w:pPr>
+      <w:r>
+        <w:rPr>
+          <w:bCs/>
+          <w:b/>
+        </w:rPr>
+        <w:t xml:space="preserve">Objection</w:t>
+      </w:r>
+      <w:r>
+        <w:t xml:space="preserve">: MDI restricts the agency of the</w:t>
+      </w:r>
+      <w:r>
+        <w:t xml:space="preserve"> </w:t>
+      </w:r>
+      <w:r>
+        <w:t xml:space="preserve">“</w:t>
+      </w:r>
+      <w:r>
+        <w:t xml:space="preserve">homeless population</w:t>
+      </w:r>
+      <w:r>
+        <w:t xml:space="preserve">”</w:t>
+      </w:r>
+      <w:r>
+        <w:t xml:space="preserve"> </w:t>
+      </w:r>
+      <w:r>
+        <w:t xml:space="preserve">and subjects them to excessive structural regulation.</w:t>
+      </w:r>
+    </w:p>
+    <w:p>
+      <w:pPr>
+        <w:pStyle w:val="BodyText"/>
+      </w:pPr>
+      <w:r>
+        <w:rPr>
+          <w:bCs/>
+          <w:b/>
+        </w:rPr>
+        <w:t xml:space="preserve">Error Vector</w:t>
+      </w:r>
+      <w:r>
+        <w:t xml:space="preserve">:</w:t>
       </w:r>
       <w:r>
         <w:t xml:space="preserve"> </w:t>
@@ -1129,18 +1090,71 @@
           <w:iCs/>
           <w:i/>
         </w:rPr>
-        <w:t xml:space="preserve">Nature Reviews Neuroscience</w:t>
-      </w:r>
-      <w:r>
-        <w:t xml:space="preserve">, 10(6), 410-422.</w:t>
-      </w:r>
-    </w:p>
-    <w:p>
-      <w:pPr>
-        <w:pStyle w:val="BodyText"/>
-      </w:pPr>
-      <w:r>
-        <w:t xml:space="preserve">ASCE. (2022).</w:t>
+        <w:t xml:space="preserve">Failing to Segment Cohorts</w:t>
+      </w:r>
+      <w:r>
+        <w:t xml:space="preserve"> </w:t>
+      </w:r>
+      <w:r>
+        <w:t xml:space="preserve">This objection fails to segment the demographic.</w:t>
+      </w:r>
+      <w:r>
+        <w:t xml:space="preserve"> </w:t>
+      </w:r>
+      <w:r>
+        <w:t xml:space="preserve">“</w:t>
+      </w:r>
+      <w:r>
+        <w:t xml:space="preserve">Homelessness</w:t>
+      </w:r>
+      <w:r>
+        <w:t xml:space="preserve">”</w:t>
+      </w:r>
+      <w:r>
+        <w:t xml:space="preserve"> </w:t>
+      </w:r>
+      <w:r>
+        <w:t xml:space="preserve">is an administrative category, not a monolithic physiological state. MDI targets the subset of the population undergoing chronic physiological decay and thermodynamic collapse in public space. Applying the stabilization requirements of this cohort to the entire unhoused demographic represents an analytical failure.</w:t>
+      </w:r>
+    </w:p>
+    <w:bookmarkEnd w:id="49"/>
+    <w:bookmarkStart w:id="50" w:name="the-fiscal-isolation-fallacy"/>
+    <w:p>
+      <w:pPr>
+        <w:pStyle w:val="Heading3"/>
+      </w:pPr>
+      <w:r>
+        <w:t xml:space="preserve">6.4 The Fiscal Isolation Fallacy</w:t>
+      </w:r>
+    </w:p>
+    <w:p>
+      <w:pPr>
+        <w:pStyle w:val="FirstParagraph"/>
+      </w:pPr>
+      <w:r>
+        <w:rPr>
+          <w:bCs/>
+          <w:b/>
+        </w:rPr>
+        <w:t xml:space="preserve">Objection</w:t>
+      </w:r>
+      <w:r>
+        <w:t xml:space="preserve">: Standalone stabilization towers, automated sanitation pods, and vertical triage infrastructure require impossible political capital expenditure.</w:t>
+      </w:r>
+    </w:p>
+    <w:p>
+      <w:pPr>
+        <w:pStyle w:val="BodyText"/>
+      </w:pPr>
+      <w:r>
+        <w:rPr>
+          <w:bCs/>
+          <w:b/>
+        </w:rPr>
+        <w:t xml:space="preserve">Error Vector</w:t>
+      </w:r>
+      <w:r>
+        <w:t xml:space="preserve">:</w:t>
       </w:r>
       <w:r>
         <w:t xml:space="preserve"> </w:t>
@@ -1150,21 +1164,53 @@
           <w:iCs/>
           <w:i/>
         </w:rPr>
-        <w:t xml:space="preserve">Minimum design loads and associated criteria for buildings and other structures</w:t>
-      </w:r>
-      <w:r>
-        <w:t xml:space="preserve"> </w:t>
-      </w:r>
-      <w:r>
-        <w:t xml:space="preserve">(ASCE/SEI 7-22). American Society of Civil Engineers.</w:t>
-      </w:r>
-    </w:p>
-    <w:p>
-      <w:pPr>
-        <w:pStyle w:val="BodyText"/>
-      </w:pPr>
-      <w:r>
-        <w:t xml:space="preserve">ASHRAE. (2019).</w:t>
+        <w:t xml:space="preserve">Ignoring Dispersed Costs</w:t>
+      </w:r>
+      <w:r>
+        <w:t xml:space="preserve"> </w:t>
+      </w:r>
+      <w:r>
+        <w:t xml:space="preserve">This critique views MDI capitalization in a fiscal vacuum. It ignores the dispersed, high-velocity expenditure of uncompensated emergency medical transport, recurring psychiatric holds, emergency room triage, and continuous police sweep operations. By ignoring the established municipal drain caused by systemic abandonment, the objection misunderstands the financial mechanics of preventative infrastructure investment (e.g., municipal social impact bonds).</w:t>
+      </w:r>
+    </w:p>
+    <w:bookmarkEnd w:id="50"/>
+    <w:bookmarkStart w:id="51" w:name="the-privacy-and-surveillance-fallacy"/>
+    <w:p>
+      <w:pPr>
+        <w:pStyle w:val="Heading3"/>
+      </w:pPr>
+      <w:r>
+        <w:t xml:space="preserve">6.5 The Privacy and Surveillance Fallacy</w:t>
+      </w:r>
+    </w:p>
+    <w:p>
+      <w:pPr>
+        <w:pStyle w:val="FirstParagraph"/>
+      </w:pPr>
+      <w:r>
+        <w:rPr>
+          <w:bCs/>
+          <w:b/>
+        </w:rPr>
+        <w:t xml:space="preserve">Objection</w:t>
+      </w:r>
+      <w:r>
+        <w:t xml:space="preserve">: Deploying biometric vestibules, automated entry monitoring, and managed clinical access violates basic civil liberties and individual privacy.</w:t>
+      </w:r>
+    </w:p>
+    <w:p>
+      <w:pPr>
+        <w:pStyle w:val="BodyText"/>
+      </w:pPr>
+      <w:r>
+        <w:rPr>
+          <w:bCs/>
+          <w:b/>
+        </w:rPr>
+        <w:t xml:space="preserve">Error Vector</w:t>
+      </w:r>
+      <w:r>
+        <w:t xml:space="preserve">:</w:t>
       </w:r>
       <w:r>
         <w:t xml:space="preserve"> </w:t>
@@ -1174,21 +1220,71 @@
           <w:iCs/>
           <w:i/>
         </w:rPr>
-        <w:t xml:space="preserve">Ventilation for acceptable indoor air quality</w:t>
-      </w:r>
-      <w:r>
-        <w:t xml:space="preserve"> </w:t>
-      </w:r>
-      <w:r>
-        <w:t xml:space="preserve">(Standard 62.1-2019). American Society of Heating, Refrigerating and Air-Conditioning Engineers.</w:t>
-      </w:r>
-    </w:p>
-    <w:p>
-      <w:pPr>
-        <w:pStyle w:val="BodyText"/>
-      </w:pPr>
-      <w:r>
-        <w:t xml:space="preserve">Batterham, D. (2020). Homelessness as capability deprivation: A conceptual model.</w:t>
+        <w:t xml:space="preserve">Misapplying Privacy Norms</w:t>
+      </w:r>
+      <w:r>
+        <w:t xml:space="preserve"> </w:t>
+      </w:r>
+      <w:r>
+        <w:t xml:space="preserve">This objection imposes middle-class privacy expectations onto a population experiencing lethal physical decay in public spaces. It prioritizes the theoretical preservation of anonymity over the biological necessity of survival. Protected, monitored access is an architectural requisite for eliminating street-level violence and assault; discarding it in the name of privacy guarantees continued predation.</w:t>
+      </w:r>
+    </w:p>
+    <w:bookmarkEnd w:id="51"/>
+    <w:bookmarkStart w:id="52" w:name="the-classification-bias-fallacy"/>
+    <w:p>
+      <w:pPr>
+        <w:pStyle w:val="Heading3"/>
+      </w:pPr>
+      <w:r>
+        <w:t xml:space="preserve">6.6 The Classification Bias Fallacy</w:t>
+      </w:r>
+    </w:p>
+    <w:p>
+      <w:pPr>
+        <w:pStyle w:val="FirstParagraph"/>
+      </w:pPr>
+      <w:r>
+        <w:rPr>
+          <w:bCs/>
+          <w:b/>
+        </w:rPr>
+        <w:t xml:space="preserve">Objection</w:t>
+      </w:r>
+      <w:r>
+        <w:t xml:space="preserve">: Defining</w:t>
+      </w:r>
+      <w:r>
+        <w:t xml:space="preserve"> </w:t>
+      </w:r>
+      <w:r>
+        <w:t xml:space="preserve">“</w:t>
+      </w:r>
+      <w:r>
+        <w:t xml:space="preserve">cognitive collapse</w:t>
+      </w:r>
+      <w:r>
+        <w:t xml:space="preserve">”</w:t>
+      </w:r>
+      <w:r>
+        <w:t xml:space="preserve"> </w:t>
+      </w:r>
+      <w:r>
+        <w:t xml:space="preserve">and mandating stabilization weaponizes medical assessment against marginalized groups and enforces behavioral conformity.</w:t>
+      </w:r>
+    </w:p>
+    <w:p>
+      <w:pPr>
+        <w:pStyle w:val="BodyText"/>
+      </w:pPr>
+      <w:r>
+        <w:rPr>
+          <w:bCs/>
+          <w:b/>
+        </w:rPr>
+        <w:t xml:space="preserve">Error Vector</w:t>
+      </w:r>
+      <w:r>
+        <w:t xml:space="preserve">:</w:t>
       </w:r>
       <w:r>
         <w:t xml:space="preserve"> </w:t>
@@ -1198,18 +1294,71 @@
           <w:iCs/>
           <w:i/>
         </w:rPr>
-        <w:t xml:space="preserve">Housing, Theory and Society</w:t>
-      </w:r>
-      <w:r>
-        <w:t xml:space="preserve">, 37(3), 274-297.</w:t>
-      </w:r>
-    </w:p>
-    <w:p>
-      <w:pPr>
-        <w:pStyle w:val="BodyText"/>
-      </w:pPr>
-      <w:r>
-        <w:t xml:space="preserve">Crocker, D. A. (2008).</w:t>
+        <w:t xml:space="preserve">Confusing Psychiatry with Biology</w:t>
+      </w:r>
+      <w:r>
+        <w:t xml:space="preserve"> </w:t>
+      </w:r>
+      <w:r>
+        <w:t xml:space="preserve">This objection confuses psychiatric variance with objective biological indicators. MDI thresholds are not determined by behavioral non-conformity; they are defined by critical thermoregulatory failure, advanced cachexia, profound sleep deprivation, and measurable physical decay. Treating empirical biological failure as a socially constructed bias misreads the clinical nature of the intervention.</w:t>
+      </w:r>
+    </w:p>
+    <w:bookmarkEnd w:id="52"/>
+    <w:bookmarkStart w:id="53" w:name="the-thermodynamic-determinism-fallacy"/>
+    <w:p>
+      <w:pPr>
+        <w:pStyle w:val="Heading3"/>
+      </w:pPr>
+      <w:r>
+        <w:t xml:space="preserve">6.7 The Thermodynamic Determinism Fallacy</w:t>
+      </w:r>
+    </w:p>
+    <w:p>
+      <w:pPr>
+        <w:pStyle w:val="FirstParagraph"/>
+      </w:pPr>
+      <w:r>
+        <w:rPr>
+          <w:bCs/>
+          <w:b/>
+        </w:rPr>
+        <w:t xml:space="preserve">Objection</w:t>
+      </w:r>
+      <w:r>
+        <w:t xml:space="preserve">: The application of</w:t>
+      </w:r>
+      <w:r>
+        <w:t xml:space="preserve"> </w:t>
+      </w:r>
+      <w:r>
+        <w:t xml:space="preserve">“</w:t>
+      </w:r>
+      <w:r>
+        <w:t xml:space="preserve">Moral Physics</w:t>
+      </w:r>
+      <w:r>
+        <w:t xml:space="preserve">”</w:t>
+      </w:r>
+      <w:r>
+        <w:t xml:space="preserve"> </w:t>
+      </w:r>
+      <w:r>
+        <w:t xml:space="preserve">and thermodynamics to human dignity is a pseudoscientific overreach that maps physical entropy onto social phenomena.</w:t>
+      </w:r>
+    </w:p>
+    <w:p>
+      <w:pPr>
+        <w:pStyle w:val="BodyText"/>
+      </w:pPr>
+      <w:r>
+        <w:rPr>
+          <w:bCs/>
+          <w:b/>
+        </w:rPr>
+        <w:t xml:space="preserve">Error Vector</w:t>
+      </w:r>
+      <w:r>
+        <w:t xml:space="preserve">:</w:t>
       </w:r>
       <w:r>
         <w:t xml:space="preserve"> </w:t>
@@ -1219,18 +1368,53 @@
           <w:iCs/>
           <w:i/>
         </w:rPr>
-        <w:t xml:space="preserve">Ethics of global development: Agency, capability, and deliberative democracy</w:t>
-      </w:r>
-      <w:r>
-        <w:t xml:space="preserve">. Cambridge University Press.</w:t>
-      </w:r>
-    </w:p>
-    <w:p>
-      <w:pPr>
-        <w:pStyle w:val="BodyText"/>
-      </w:pPr>
-      <w:r>
-        <w:t xml:space="preserve">DeVerteuil, G. (2015).</w:t>
+        <w:t xml:space="preserve">Literalizing Analogies</w:t>
+      </w:r>
+      <w:r>
+        <w:t xml:space="preserve"> </w:t>
+      </w:r>
+      <w:r>
+        <w:t xml:space="preserve">This objection mistakes a conceptual model for a formal mathematical equation. MDI applies thermodynamics as an analogical heuristic to illustrate how biological life operates as an open system that must continuously import negative entropy to survive. It bridges the gap between the material requirement to arrest entropic slide and the moral obligation of the state.</w:t>
+      </w:r>
+    </w:p>
+    <w:bookmarkEnd w:id="53"/>
+    <w:bookmarkStart w:id="54" w:name="the-engineering-feasibility-fallacy"/>
+    <w:p>
+      <w:pPr>
+        <w:pStyle w:val="Heading3"/>
+      </w:pPr>
+      <w:r>
+        <w:t xml:space="preserve">6.8 The Engineering Feasibility Fallacy</w:t>
+      </w:r>
+    </w:p>
+    <w:p>
+      <w:pPr>
+        <w:pStyle w:val="FirstParagraph"/>
+      </w:pPr>
+      <w:r>
+        <w:rPr>
+          <w:bCs/>
+          <w:b/>
+        </w:rPr>
+        <w:t xml:space="preserve">Objection</w:t>
+      </w:r>
+      <w:r>
+        <w:t xml:space="preserve">: Zoning regulations, building codes, and community opposition (NIMBYism) make the rapid deployment of standardized pods and Vertically Integrated Stabilization Towers structurally impossible.</w:t>
+      </w:r>
+    </w:p>
+    <w:p>
+      <w:pPr>
+        <w:pStyle w:val="BodyText"/>
+      </w:pPr>
+      <w:r>
+        <w:rPr>
+          <w:bCs/>
+          <w:b/>
+        </w:rPr>
+        <w:t xml:space="preserve">Error Vector</w:t>
+      </w:r>
+      <w:r>
+        <w:t xml:space="preserve">:</w:t>
       </w:r>
       <w:r>
         <w:t xml:space="preserve"> </w:t>
@@ -1240,18 +1424,190 @@
           <w:iCs/>
           <w:i/>
         </w:rPr>
-        <w:t xml:space="preserve">Resilience in the post-welfare inner city: Voluntary sector geographies in London, Los Angeles and Sydney</w:t>
-      </w:r>
-      <w:r>
-        <w:t xml:space="preserve">. Policy Press.</w:t>
-      </w:r>
-    </w:p>
-    <w:p>
-      <w:pPr>
-        <w:pStyle w:val="BodyText"/>
-      </w:pPr>
-      <w:r>
-        <w:t xml:space="preserve">Gowan, T. (2010).</w:t>
+        <w:t xml:space="preserve">Surrendering to Zoning Codes</w:t>
+      </w:r>
+      <w:r>
+        <w:t xml:space="preserve"> </w:t>
+      </w:r>
+      <w:r>
+        <w:t xml:space="preserve">This objection accepts municipal administrative barriers as permanent laws of nature. MDI positions these infrastructure developments as critical public utilities, bypassing standard residential zoning queues through emergency or utility-classification structures. Treating regulatory hurdles as insurmountable stops systemic public works reform.</w:t>
+      </w:r>
+    </w:p>
+    <w:bookmarkEnd w:id="54"/>
+    <w:bookmarkEnd w:id="55"/>
+    <w:bookmarkStart w:id="58" w:name="conclusion"/>
+    <w:p>
+      <w:pPr>
+        <w:pStyle w:val="Heading2"/>
+      </w:pPr>
+      <w:r>
+        <w:t xml:space="preserve">7. Conclusion</w:t>
+      </w:r>
+    </w:p>
+    <w:bookmarkStart w:id="56" w:name="summary-of-the-model-shift"/>
+    <w:p>
+      <w:pPr>
+        <w:pStyle w:val="Heading3"/>
+      </w:pPr>
+      <w:r>
+        <w:t xml:space="preserve">7.1 Summary of the Model Shift</w:t>
+      </w:r>
+    </w:p>
+    <w:p>
+      <w:pPr>
+        <w:pStyle w:val="FirstParagraph"/>
+      </w:pPr>
+      <w:r>
+        <w:t xml:space="preserve">Urban design provides the primary mechanism for arresting bodily decay among vulnerable populations (Westbrook &amp; Robinson, 2021). Before implementing sociological or programmatic interventions, municipalities must restructure public spaces to support physiological stabilization. Engineering survival infrastructure enables municipal authorities to rebuild the fragile material foundations required for human agency and long-term recovery.</w:t>
+      </w:r>
+    </w:p>
+    <w:p>
+      <w:pPr>
+        <w:pStyle w:val="BodyText"/>
+      </w:pPr>
+      <w:r>
+        <w:t xml:space="preserve">The current municipal approach to homelessness is a structural failure disguised as a social problem. By demanding programmatic compliance from individuals whose cognitive capacity has been dismantled by environmental trauma, cities guarantee the failure of their own programs. We must recognize that the body’s physical integrity is the prerequisite for any form of social or economic recovery.</w:t>
+      </w:r>
+    </w:p>
+    <w:p>
+      <w:pPr>
+        <w:pStyle w:val="BodyText"/>
+      </w:pPr>
+      <w:r>
+        <w:t xml:space="preserve">To build a humane and rational city, we must treat the physical environment as a moral variable. The design of our public spaces must reflect an understanding of human biology and thermodynamic needs. By deploying MDI and establishing a biological floor, we can halt the progressive decay of our most vulnerable citizens, rebuilding the material foundations of the social contract.</w:t>
+      </w:r>
+    </w:p>
+    <w:p>
+      <w:pPr>
+        <w:pStyle w:val="BodyText"/>
+      </w:pPr>
+      <w:r>
+        <w:t xml:space="preserve">This model shift requires a rejection of the voluntaristic housing models that dominate modern social policy. We must accept that when an individual’s cognitive agency has collapsed, the municipal government has a positive obligation to intervene, stabilize, and rebuild that agency. This commitment must be operationalized through permanent, standardized public infrastructure.</w:t>
+      </w:r>
+    </w:p>
+    <w:bookmarkEnd w:id="56"/>
+    <w:bookmarkStart w:id="57" w:name="future-research-directions"/>
+    <w:p>
+      <w:pPr>
+        <w:pStyle w:val="Heading3"/>
+      </w:pPr>
+      <w:r>
+        <w:t xml:space="preserve">7.2 Future Research Directions</w:t>
+      </w:r>
+    </w:p>
+    <w:p>
+      <w:pPr>
+        <w:pStyle w:val="FirstParagraph"/>
+      </w:pPr>
+      <w:r>
+        <w:t xml:space="preserve">The integration of neurobiology, thermodynamics, and urban planning represents a new field of study for social policy. Future research must focus on measuring the precise cognitive and physiological impacts of different physical environments. By conducting longitudinal studies of individuals in MDI installations, researchers can refine the engineering specifications for stabilization infrastructure.</w:t>
+      </w:r>
+    </w:p>
+    <w:p>
+      <w:pPr>
+        <w:pStyle w:val="BodyText"/>
+      </w:pPr>
+      <w:r>
+        <w:t xml:space="preserve">To measure these effects, researchers must track biomarkers of chronic stress, including cortisol and inflammatory cytokines, before and after placement in stabilization towers. Cognitive testing must evaluate changes in executive functioning, working memory, and decision-making capacity over time, documenting the rate of neurological recovery.</w:t>
+      </w:r>
+    </w:p>
+    <w:p>
+      <w:pPr>
+        <w:pStyle w:val="BodyText"/>
+      </w:pPr>
+      <w:r>
+        <w:t xml:space="preserve">Economists must develop broader models for evaluating the long-term fiscal benefits of preventative infrastructure. These models must account for the indirect savings in emergency healthcare, public protection, and tourism revenue. By demonstrating the long-term financial viability of MDI, social scientists and economists can collaborate to build the broad political and civic consensus necessary for large-scale municipal deployment across urban centers.</w:t>
+      </w:r>
+    </w:p>
+    <w:p>
+      <w:pPr>
+        <w:pStyle w:val="BodyText"/>
+      </w:pPr>
+      <w:r>
+        <w:t xml:space="preserve">The goal of this research is to establish design guidelines that make extreme precarity impossible. By engineering the city to support human biology, we can guarantee that the physical prerequisites of agency are protected for all, fulfilling the moral obligations of a civilized society.</w:t>
+      </w:r>
+    </w:p>
+    <w:bookmarkEnd w:id="57"/>
+    <w:bookmarkEnd w:id="58"/>
+    <w:bookmarkStart w:id="62" w:name="declarations"/>
+    <w:p>
+      <w:pPr>
+        <w:pStyle w:val="Heading2"/>
+      </w:pPr>
+      <w:r>
+        <w:t xml:space="preserve">Declarations</w:t>
+      </w:r>
+    </w:p>
+    <w:bookmarkStart w:id="59" w:name="funding"/>
+    <w:p>
+      <w:pPr>
+        <w:pStyle w:val="Heading3"/>
+      </w:pPr>
+      <w:r>
+        <w:t xml:space="preserve">Funding</w:t>
+      </w:r>
+    </w:p>
+    <w:p>
+      <w:pPr>
+        <w:pStyle w:val="FirstParagraph"/>
+      </w:pPr>
+      <w:r>
+        <w:t xml:space="preserve">This work received no grant from any funding agency in the public, commercial, or not-for-profit sectors.</w:t>
+      </w:r>
+    </w:p>
+    <w:bookmarkEnd w:id="59"/>
+    <w:bookmarkStart w:id="60" w:name="disclosure-statement"/>
+    <w:p>
+      <w:pPr>
+        <w:pStyle w:val="Heading3"/>
+      </w:pPr>
+      <w:r>
+        <w:t xml:space="preserve">Disclosure Statement</w:t>
+      </w:r>
+    </w:p>
+    <w:p>
+      <w:pPr>
+        <w:pStyle w:val="FirstParagraph"/>
+      </w:pPr>
+      <w:r>
+        <w:t xml:space="preserve">No potential conflict of interest was reported by the authors.</w:t>
+      </w:r>
+    </w:p>
+    <w:bookmarkEnd w:id="60"/>
+    <w:bookmarkStart w:id="61" w:name="data-availability-statement"/>
+    <w:p>
+      <w:pPr>
+        <w:pStyle w:val="Heading3"/>
+      </w:pPr>
+      <w:r>
+        <w:t xml:space="preserve">Data Availability Statement</w:t>
+      </w:r>
+    </w:p>
+    <w:p>
+      <w:pPr>
+        <w:pStyle w:val="FirstParagraph"/>
+      </w:pPr>
+      <w:r>
+        <w:t xml:space="preserve">Data sharing is not applicable to this article as no new datasets were created or analyzed.</w:t>
+      </w:r>
+    </w:p>
+    <w:bookmarkEnd w:id="61"/>
+    <w:bookmarkEnd w:id="62"/>
+    <w:bookmarkStart w:id="63" w:name="references"/>
+    <w:p>
+      <w:pPr>
+        <w:pStyle w:val="Heading2"/>
+      </w:pPr>
+      <w:r>
+        <w:t xml:space="preserve">References</w:t>
+      </w:r>
+    </w:p>
+    <w:p>
+      <w:pPr>
+        <w:pStyle w:val="FirstParagraph"/>
+      </w:pPr>
+      <w:r>
+        <w:t xml:space="preserve">Appelbaum, P. S. (1994).</w:t>
       </w:r>
       <w:r>
         <w:t xml:space="preserve"> </w:t>
@@ -1261,18 +1617,18 @@
           <w:iCs/>
           <w:i/>
         </w:rPr>
-        <w:t xml:space="preserve">Hobos, hustlers, and backsliders: Homeless in San Francisco</w:t>
-      </w:r>
-      <w:r>
-        <w:t xml:space="preserve">. University of Minnesota Press.</w:t>
-      </w:r>
-    </w:p>
-    <w:p>
-      <w:pPr>
-        <w:pStyle w:val="BodyText"/>
-      </w:pPr>
-      <w:r>
-        <w:t xml:space="preserve">Maritain, J. (1951).</w:t>
+        <w:t xml:space="preserve">Almost a revolution: Mental health law and the limits of change</w:t>
+      </w:r>
+      <w:r>
+        <w:t xml:space="preserve">. Oxford University Press.</w:t>
+      </w:r>
+    </w:p>
+    <w:p>
+      <w:pPr>
+        <w:pStyle w:val="BodyText"/>
+      </w:pPr>
+      <w:r>
+        <w:t xml:space="preserve">Aravena, A. (2016).</w:t>
       </w:r>
       <w:r>
         <w:t xml:space="preserve"> </w:t>
@@ -1282,18 +1638,18 @@
           <w:iCs/>
           <w:i/>
         </w:rPr>
-        <w:t xml:space="preserve">Man and the state</w:t>
-      </w:r>
-      <w:r>
-        <w:t xml:space="preserve">. University of Chicago Press.</w:t>
-      </w:r>
-    </w:p>
-    <w:p>
-      <w:pPr>
-        <w:pStyle w:val="BodyText"/>
-      </w:pPr>
-      <w:r>
-        <w:t xml:space="preserve">McEwen, B. S. (2017). Neurobiological and systemic effects of chronic stress.</w:t>
+        <w:t xml:space="preserve">Elemental: Incremental housing and participatory design manual</w:t>
+      </w:r>
+      <w:r>
+        <w:t xml:space="preserve">. Hatje Cantz.</w:t>
+      </w:r>
+    </w:p>
+    <w:p>
+      <w:pPr>
+        <w:pStyle w:val="BodyText"/>
+      </w:pPr>
+      <w:r>
+        <w:t xml:space="preserve">Arnsten, A. F. (2009). Stress signalling pathways that impair prefrontal cortex structure and function.</w:t>
       </w:r>
       <w:r>
         <w:t xml:space="preserve"> </w:t>
@@ -1303,18 +1659,18 @@
           <w:iCs/>
           <w:i/>
         </w:rPr>
-        <w:t xml:space="preserve">Chronic Stress</w:t>
-      </w:r>
-      <w:r>
-        <w:t xml:space="preserve">, 1.</w:t>
-      </w:r>
-    </w:p>
-    <w:p>
-      <w:pPr>
-        <w:pStyle w:val="BodyText"/>
-      </w:pPr>
-      <w:r>
-        <w:t xml:space="preserve">Mitchell, D. (1997). The annihilation of space by law: The anti-homeless laws and the shrinking of public space in American cities.</w:t>
+        <w:t xml:space="preserve">Nature Reviews Neuroscience</w:t>
+      </w:r>
+      <w:r>
+        <w:t xml:space="preserve">, 10(6), 410-422.</w:t>
+      </w:r>
+    </w:p>
+    <w:p>
+      <w:pPr>
+        <w:pStyle w:val="BodyText"/>
+      </w:pPr>
+      <w:r>
+        <w:t xml:space="preserve">ASCE. (2022).</w:t>
       </w:r>
       <w:r>
         <w:t xml:space="preserve"> </w:t>
@@ -1324,18 +1680,21 @@
           <w:iCs/>
           <w:i/>
         </w:rPr>
-        <w:t xml:space="preserve">Antipode</w:t>
-      </w:r>
-      <w:r>
-        <w:t xml:space="preserve">, 29(3), 303–335.</w:t>
-      </w:r>
-    </w:p>
-    <w:p>
-      <w:pPr>
-        <w:pStyle w:val="BodyText"/>
-      </w:pPr>
-      <w:r>
-        <w:t xml:space="preserve">Nussbaum, M. C. (2011).</w:t>
+        <w:t xml:space="preserve">Minimum design loads and associated criteria for buildings and other structures</w:t>
+      </w:r>
+      <w:r>
+        <w:t xml:space="preserve"> </w:t>
+      </w:r>
+      <w:r>
+        <w:t xml:space="preserve">(ASCE/SEI 7-22). American Society of Civil Engineers.</w:t>
+      </w:r>
+    </w:p>
+    <w:p>
+      <w:pPr>
+        <w:pStyle w:val="BodyText"/>
+      </w:pPr>
+      <w:r>
+        <w:t xml:space="preserve">ASHRAE. (2019).</w:t>
       </w:r>
       <w:r>
         <w:t xml:space="preserve"> </w:t>
@@ -1345,18 +1704,21 @@
           <w:iCs/>
           <w:i/>
         </w:rPr>
-        <w:t xml:space="preserve">Creating capabilities: The human development approach</w:t>
-      </w:r>
-      <w:r>
-        <w:t xml:space="preserve">. Harvard University Press.</w:t>
-      </w:r>
-    </w:p>
-    <w:p>
-      <w:pPr>
-        <w:pStyle w:val="BodyText"/>
-      </w:pPr>
-      <w:r>
-        <w:t xml:space="preserve">Roth, M. (2001). Guardianship and the least restrictive alternative.</w:t>
+        <w:t xml:space="preserve">Ventilation for acceptable indoor air quality</w:t>
+      </w:r>
+      <w:r>
+        <w:t xml:space="preserve"> </w:t>
+      </w:r>
+      <w:r>
+        <w:t xml:space="preserve">(Standard 62.1-2019). American Society of Heating, Refrigerating and Air-Conditioning Engineers.</w:t>
+      </w:r>
+    </w:p>
+    <w:p>
+      <w:pPr>
+        <w:pStyle w:val="BodyText"/>
+      </w:pPr>
+      <w:r>
+        <w:t xml:space="preserve">Batterham, D. (2020). Homelessness as capability deprivation: A conceptual model.</w:t>
       </w:r>
       <w:r>
         <w:t xml:space="preserve"> </w:t>
@@ -1366,18 +1728,18 @@
           <w:iCs/>
           <w:i/>
         </w:rPr>
-        <w:t xml:space="preserve">Journal of Health Politics, Policy and Law</w:t>
-      </w:r>
-      <w:r>
-        <w:t xml:space="preserve">, 26(3), 603-625.</w:t>
-      </w:r>
-    </w:p>
-    <w:p>
-      <w:pPr>
-        <w:pStyle w:val="BodyText"/>
-      </w:pPr>
-      <w:r>
-        <w:t xml:space="preserve">Sapolsky, R. M. (2004).</w:t>
+        <w:t xml:space="preserve">Housing, Theory and Society</w:t>
+      </w:r>
+      <w:r>
+        <w:t xml:space="preserve">, 37(3), 274-297.</w:t>
+      </w:r>
+    </w:p>
+    <w:p>
+      <w:pPr>
+        <w:pStyle w:val="BodyText"/>
+      </w:pPr>
+      <w:r>
+        <w:t xml:space="preserve">Crocker, D. A. (2008).</w:t>
       </w:r>
       <w:r>
         <w:t xml:space="preserve"> </w:t>
@@ -1387,18 +1749,18 @@
           <w:iCs/>
           <w:i/>
         </w:rPr>
-        <w:t xml:space="preserve">Why zebras don’t get ulcers</w:t>
-      </w:r>
-      <w:r>
-        <w:t xml:space="preserve">. Holt Paperbacks.</w:t>
-      </w:r>
-    </w:p>
-    <w:p>
-      <w:pPr>
-        <w:pStyle w:val="BodyText"/>
-      </w:pPr>
-      <w:r>
-        <w:t xml:space="preserve">Sen, A. (1999).</w:t>
+        <w:t xml:space="preserve">Ethics of global development: Agency, capability, and deliberative democracy</w:t>
+      </w:r>
+      <w:r>
+        <w:t xml:space="preserve">. Cambridge University Press.</w:t>
+      </w:r>
+    </w:p>
+    <w:p>
+      <w:pPr>
+        <w:pStyle w:val="BodyText"/>
+      </w:pPr>
+      <w:r>
+        <w:t xml:space="preserve">DeVerteuil, G. (2015).</w:t>
       </w:r>
       <w:r>
         <w:t xml:space="preserve"> </w:t>
@@ -1408,18 +1770,18 @@
           <w:iCs/>
           <w:i/>
         </w:rPr>
-        <w:t xml:space="preserve">Development as freedom</w:t>
-      </w:r>
-      <w:r>
-        <w:t xml:space="preserve">. Oxford University Press.</w:t>
-      </w:r>
-    </w:p>
-    <w:p>
-      <w:pPr>
-        <w:pStyle w:val="BodyText"/>
-      </w:pPr>
-      <w:r>
-        <w:t xml:space="preserve">Szasz, T. S. (1960). The myth of mental illness.</w:t>
+        <w:t xml:space="preserve">Resilience in the post-welfare inner city: Voluntary sector geographies in London, Los Angeles and Sydney</w:t>
+      </w:r>
+      <w:r>
+        <w:t xml:space="preserve">. Policy Press.</w:t>
+      </w:r>
+    </w:p>
+    <w:p>
+      <w:pPr>
+        <w:pStyle w:val="BodyText"/>
+      </w:pPr>
+      <w:r>
+        <w:t xml:space="preserve">Gowan, T. (2010).</w:t>
       </w:r>
       <w:r>
         <w:t xml:space="preserve"> </w:t>
@@ -1429,18 +1791,18 @@
           <w:iCs/>
           <w:i/>
         </w:rPr>
-        <w:t xml:space="preserve">American Psychologist</w:t>
-      </w:r>
-      <w:r>
-        <w:t xml:space="preserve">, 15(2), 113-118.</w:t>
-      </w:r>
-    </w:p>
-    <w:p>
-      <w:pPr>
-        <w:pStyle w:val="BodyText"/>
-      </w:pPr>
-      <w:r>
-        <w:t xml:space="preserve">Tsemberis, S., Gulcur, L., &amp; Nakae, M. (2004). Housing First, consumer choice, and harm reduction for individuals who are homeless and have co-occurring disorders.</w:t>
+        <w:t xml:space="preserve">Hobos, hustlers, and backsliders: Homeless in San Francisco</w:t>
+      </w:r>
+      <w:r>
+        <w:t xml:space="preserve">. University of Minnesota Press.</w:t>
+      </w:r>
+    </w:p>
+    <w:p>
+      <w:pPr>
+        <w:pStyle w:val="BodyText"/>
+      </w:pPr>
+      <w:r>
+        <w:t xml:space="preserve">Maritain, J. (1951).</w:t>
       </w:r>
       <w:r>
         <w:t xml:space="preserve"> </w:t>
@@ -1450,18 +1812,18 @@
           <w:iCs/>
           <w:i/>
         </w:rPr>
-        <w:t xml:space="preserve">American Journal of Public Health</w:t>
-      </w:r>
-      <w:r>
-        <w:t xml:space="preserve">, 94(4), 651–656.</w:t>
-      </w:r>
-    </w:p>
-    <w:p>
-      <w:pPr>
-        <w:pStyle w:val="BodyText"/>
-      </w:pPr>
-      <w:r>
-        <w:t xml:space="preserve">Walker, M. (2017).</w:t>
+        <w:t xml:space="preserve">Man and the state</w:t>
+      </w:r>
+      <w:r>
+        <w:t xml:space="preserve">. University of Chicago Press.</w:t>
+      </w:r>
+    </w:p>
+    <w:p>
+      <w:pPr>
+        <w:pStyle w:val="BodyText"/>
+      </w:pPr>
+      <w:r>
+        <w:t xml:space="preserve">McEwen, B. S. (2017). Neurobiological and systemic effects of chronic stress.</w:t>
       </w:r>
       <w:r>
         <w:t xml:space="preserve"> </w:t>
@@ -1471,18 +1833,18 @@
           <w:iCs/>
           <w:i/>
         </w:rPr>
-        <w:t xml:space="preserve">Why we sleep: Unlocking the power of sleep and dreams</w:t>
-      </w:r>
-      <w:r>
-        <w:t xml:space="preserve">. Simon and Schuster.</w:t>
-      </w:r>
-    </w:p>
-    <w:p>
-      <w:pPr>
-        <w:pStyle w:val="BodyText"/>
-      </w:pPr>
-      <w:r>
-        <w:t xml:space="preserve">Westbrook, M., &amp; Robinson, T. (2021). Unhealthy by design: Health and safety consequences of the criminalization of homelessness.</w:t>
+        <w:t xml:space="preserve">Chronic Stress</w:t>
+      </w:r>
+      <w:r>
+        <w:t xml:space="preserve">, 1.</w:t>
+      </w:r>
+    </w:p>
+    <w:p>
+      <w:pPr>
+        <w:pStyle w:val="BodyText"/>
+      </w:pPr>
+      <w:r>
+        <w:t xml:space="preserve">Mitchell, D. (1997). The annihilation of space by law: The anti-homeless laws and the shrinking of public space in American cities.</w:t>
       </w:r>
       <w:r>
         <w:t xml:space="preserve"> </w:t>
@@ -1492,14 +1854,182 @@
           <w:iCs/>
           <w:i/>
         </w:rPr>
+        <w:t xml:space="preserve">Antipode</w:t>
+      </w:r>
+      <w:r>
+        <w:t xml:space="preserve">, 29(3), 303–335.</w:t>
+      </w:r>
+    </w:p>
+    <w:p>
+      <w:pPr>
+        <w:pStyle w:val="BodyText"/>
+      </w:pPr>
+      <w:r>
+        <w:t xml:space="preserve">Nussbaum, M. C. (2011).</w:t>
+      </w:r>
+      <w:r>
+        <w:t xml:space="preserve"> </w:t>
+      </w:r>
+      <w:r>
+        <w:rPr>
+          <w:iCs/>
+          <w:i/>
+        </w:rPr>
+        <w:t xml:space="preserve">Creating capabilities: The human development approach</w:t>
+      </w:r>
+      <w:r>
+        <w:t xml:space="preserve">. Harvard University Press.</w:t>
+      </w:r>
+    </w:p>
+    <w:p>
+      <w:pPr>
+        <w:pStyle w:val="BodyText"/>
+      </w:pPr>
+      <w:r>
+        <w:t xml:space="preserve">Roth, M. (2001). Guardianship and the least restrictive alternative.</w:t>
+      </w:r>
+      <w:r>
+        <w:t xml:space="preserve"> </w:t>
+      </w:r>
+      <w:r>
+        <w:rPr>
+          <w:iCs/>
+          <w:i/>
+        </w:rPr>
+        <w:t xml:space="preserve">Journal of Health Politics, Policy and Law</w:t>
+      </w:r>
+      <w:r>
+        <w:t xml:space="preserve">, 26(3), 603-625.</w:t>
+      </w:r>
+    </w:p>
+    <w:p>
+      <w:pPr>
+        <w:pStyle w:val="BodyText"/>
+      </w:pPr>
+      <w:r>
+        <w:t xml:space="preserve">Sapolsky, R. M. (2004).</w:t>
+      </w:r>
+      <w:r>
+        <w:t xml:space="preserve"> </w:t>
+      </w:r>
+      <w:r>
+        <w:rPr>
+          <w:iCs/>
+          <w:i/>
+        </w:rPr>
+        <w:t xml:space="preserve">Why zebras don’t get ulcers</w:t>
+      </w:r>
+      <w:r>
+        <w:t xml:space="preserve">. Holt Paperbacks.</w:t>
+      </w:r>
+    </w:p>
+    <w:p>
+      <w:pPr>
+        <w:pStyle w:val="BodyText"/>
+      </w:pPr>
+      <w:r>
+        <w:t xml:space="preserve">Sen, A. (1999).</w:t>
+      </w:r>
+      <w:r>
+        <w:t xml:space="preserve"> </w:t>
+      </w:r>
+      <w:r>
+        <w:rPr>
+          <w:iCs/>
+          <w:i/>
+        </w:rPr>
+        <w:t xml:space="preserve">Development as freedom</w:t>
+      </w:r>
+      <w:r>
+        <w:t xml:space="preserve">. Oxford University Press.</w:t>
+      </w:r>
+    </w:p>
+    <w:p>
+      <w:pPr>
+        <w:pStyle w:val="BodyText"/>
+      </w:pPr>
+      <w:r>
+        <w:t xml:space="preserve">Szasz, T. S. (1960). The myth of mental illness.</w:t>
+      </w:r>
+      <w:r>
+        <w:t xml:space="preserve"> </w:t>
+      </w:r>
+      <w:r>
+        <w:rPr>
+          <w:iCs/>
+          <w:i/>
+        </w:rPr>
+        <w:t xml:space="preserve">American Psychologist</w:t>
+      </w:r>
+      <w:r>
+        <w:t xml:space="preserve">, 15(2), 113-118.</w:t>
+      </w:r>
+    </w:p>
+    <w:p>
+      <w:pPr>
+        <w:pStyle w:val="BodyText"/>
+      </w:pPr>
+      <w:r>
+        <w:t xml:space="preserve">Tsemberis, S., Gulcur, L., &amp; Nakae, M. (2004). Housing First, consumer choice, and harm reduction for individuals who are homeless and have co-occurring disorders.</w:t>
+      </w:r>
+      <w:r>
+        <w:t xml:space="preserve"> </w:t>
+      </w:r>
+      <w:r>
+        <w:rPr>
+          <w:iCs/>
+          <w:i/>
+        </w:rPr>
+        <w:t xml:space="preserve">American Journal of Public Health</w:t>
+      </w:r>
+      <w:r>
+        <w:t xml:space="preserve">, 94(4), 651–656.</w:t>
+      </w:r>
+    </w:p>
+    <w:p>
+      <w:pPr>
+        <w:pStyle w:val="BodyText"/>
+      </w:pPr>
+      <w:r>
+        <w:t xml:space="preserve">Walker, M. (2017).</w:t>
+      </w:r>
+      <w:r>
+        <w:t xml:space="preserve"> </w:t>
+      </w:r>
+      <w:r>
+        <w:rPr>
+          <w:iCs/>
+          <w:i/>
+        </w:rPr>
+        <w:t xml:space="preserve">Why we sleep: Unlocking the power of sleep and dreams</w:t>
+      </w:r>
+      <w:r>
+        <w:t xml:space="preserve">. Simon and Schuster.</w:t>
+      </w:r>
+    </w:p>
+    <w:p>
+      <w:pPr>
+        <w:pStyle w:val="BodyText"/>
+      </w:pPr>
+      <w:r>
+        <w:t xml:space="preserve">Westbrook, M., &amp; Robinson, T. (2021). Unhealthy by design: Health and safety consequences of the criminalization of homelessness.</w:t>
+      </w:r>
+      <w:r>
+        <w:t xml:space="preserve"> </w:t>
+      </w:r>
+      <w:r>
+        <w:rPr>
+          <w:iCs/>
+          <w:i/>
+        </w:rPr>
         <w:t xml:space="preserve">Journal of Social Distress and Homelessness</w:t>
       </w:r>
       <w:r>
         <w:t xml:space="preserve">, 30(2), 107–115.</w:t>
       </w:r>
     </w:p>
-    <w:bookmarkEnd w:id="54"/>
-    <w:bookmarkEnd w:id="55"/>
+    <w:bookmarkEnd w:id="63"/>
+    <w:bookmarkEnd w:id="64"/>
     <w:sectPr/>
   </w:body>
 </w:document>

</xml_diff>

<commit_message>
feat(jsdh): expand Section 6 objections with predator-victim and silver bullet fallacies
</commit_message>
<xml_diff>
--- a/networking/jsdh/Manuscript_Anonymous.docx
+++ b/networking/jsdh/Manuscript_Anonymous.docx
@@ -2,7 +2,7 @@
 <file path=word/document.xml><?xml version="1.0" encoding="utf-8"?>
 <w:document xmlns:w="http://schemas.openxmlformats.org/wordprocessingml/2006/main" xmlns:m="http://schemas.openxmlformats.org/officeDocument/2006/math" xmlns:r="http://schemas.openxmlformats.org/officeDocument/2006/relationships" xmlns:o="urn:schemas-microsoft-com:office:office" xmlns:v="urn:schemas-microsoft-com:vml" xmlns:w10="urn:schemas-microsoft-com:office:word" xmlns:a="http://schemas.openxmlformats.org/drawingml/2006/main" xmlns:pic="http://schemas.openxmlformats.org/drawingml/2006/picture" xmlns:wp="http://schemas.openxmlformats.org/drawingml/2006/wordprocessingDrawing">
   <w:body>
-    <w:bookmarkStart w:id="64" w:name="the-moral-physics-of-survival"/>
+    <w:bookmarkStart w:id="66" w:name="the-moral-physics-of-survival"/>
     <w:p>
       <w:pPr>
         <w:pStyle w:val="Heading1"/>
@@ -905,13 +905,21 @@
     </w:p>
     <w:bookmarkEnd w:id="45"/>
     <w:bookmarkEnd w:id="46"/>
-    <w:bookmarkStart w:id="55" w:name="Xa30a2fe7a1d6246103c5fdeb305b8920b271ff7"/>
+    <w:bookmarkStart w:id="57" w:name="Xa30a2fe7a1d6246103c5fdeb305b8920b271ff7"/>
     <w:p>
       <w:pPr>
         <w:pStyle w:val="Heading2"/>
       </w:pPr>
       <w:r>
         <w:t xml:space="preserve">6. Anticipated Objections to the MDI Structure</w:t>
+      </w:r>
+    </w:p>
+    <w:p>
+      <w:pPr>
+        <w:pStyle w:val="FirstParagraph"/>
+      </w:pPr>
+      <w:r>
+        <w:t xml:space="preserve">Every objection cataloged below shares a single root error: the assumption that individuals below the thermodynamic survival threshold retain intact cognitive agency. When chronic HPA-axis overactivation has degraded prefrontal cortex function to the point of biological collapse, the capacity to exercise liberty, consent, privacy, or economic choice ceases to exist as a neurological fact. Each fallacy below derives from this false premise.</w:t>
       </w:r>
     </w:p>
     <w:bookmarkStart w:id="47" w:name="the-technocratic-authoritarian-fallacy"/>
@@ -966,7 +974,7 @@
         <w:t xml:space="preserve"> </w:t>
       </w:r>
       <w:r>
-        <w:t xml:space="preserve">This objection ignores the boundary condition of the MDI structure: compulsion applies only when biological and cognitive agency collapses below the objective thermodynamic survival threshold. It conflates individuals suffering from temporary economic displacement with those experiencing chronic physiological collapse. By assuming intact cognitive agency where neurobiological degradation (e.g., cortisol toxicity, executive dysfunction) has occurred, this critique prioritizes the theoretical aesthetic of negative liberty over the physical reality of biological survival.</w:t>
+        <w:t xml:space="preserve">This objection ignores the boundary condition of the MDI structure: compulsion applies only when biological and cognitive agency collapses below the objective thermodynamic survival threshold. It conflates individuals suffering from temporary economic displacement with those experiencing chronic physiological collapse. By assuming intact cognitive agency where neurobiological degradation (e.g., cortisol toxicity, executive dysfunction) has occurred, this critique prioritizes the theoretical aesthetic of negative liberty over the physical reality of biological survival. Compelled extraction under conservatorship operates as a medical instrument under the Lanterman-Petris-Short Act, not a police action; secular natural law (Maritain, 1951) and the Capability Approach (Sen, 1999; Nussbaum, 2011) both ground the state’s positive obligation to preserve the biological basis of personhood.</w:t>
       </w:r>
     </w:p>
     <w:bookmarkEnd w:id="47"/>
@@ -1170,7 +1178,7 @@
         <w:t xml:space="preserve"> </w:t>
       </w:r>
       <w:r>
-        <w:t xml:space="preserve">This critique views MDI capitalization in a fiscal vacuum. It ignores the dispersed, high-velocity expenditure of uncompensated emergency medical transport, recurring psychiatric holds, emergency room triage, and continuous police sweep operations. By ignoring the established municipal drain caused by systemic abandonment, the objection misunderstands the financial mechanics of preventative infrastructure investment (e.g., municipal social impact bonds).</w:t>
+        <w:t xml:space="preserve">This critique views MDI capitalization in a fiscal vacuum. It ignores the dispersed, high-velocity expenditure of uncompensated emergency medical transport, recurring psychiatric holds, emergency room triage, and continuous police sweep operations. By ignoring the established municipal drain caused by systemic abandonment, the objection misunderstands the financial mechanics of preventative infrastructure investment (e.g., municipal social impact bonds). Acquiring distressed Class B/C commercial towers at post-COVID discounts reduces all-in conversion costs to roughly one-sixth of ground-up construction (Urban Land Institute, 2023), converting real estate market correction into fiscal stewardship rather than speculation.</w:t>
       </w:r>
     </w:p>
     <w:bookmarkEnd w:id="50"/>
@@ -1226,7 +1234,7 @@
         <w:t xml:space="preserve"> </w:t>
       </w:r>
       <w:r>
-        <w:t xml:space="preserve">This objection imposes middle-class privacy expectations onto a population experiencing lethal physical decay in public spaces. It prioritizes the theoretical preservation of anonymity over the biological necessity of survival. Protected, monitored access is an architectural requisite for eliminating street-level violence and assault; discarding it in the name of privacy guarantees continued predation.</w:t>
+        <w:t xml:space="preserve">This objection imposes middle-class privacy expectations onto a population experiencing lethal physical decay in public spaces. It prioritizes the theoretical preservation of anonymity over the biological necessity of survival. Protected, monitored access is an architectural requisite for eliminating street-level violence and assault; discarding it in the name of privacy guarantees continued predation. Defensible Space Theory (Newman, 1972) resolves the apparent contradiction between open access and population protection: a no-gate ground-floor commons provides survival services without identification, while secured residential floors enforce biometric access to protect the stabilized population from predatory intrusion.</w:t>
       </w:r>
     </w:p>
     <w:bookmarkEnd w:id="51"/>
@@ -1300,7 +1308,7 @@
         <w:t xml:space="preserve"> </w:t>
       </w:r>
       <w:r>
-        <w:t xml:space="preserve">This objection confuses psychiatric variance with objective biological indicators. MDI thresholds are not determined by behavioral non-conformity; they are defined by critical thermoregulatory failure, advanced cachexia, profound sleep deprivation, and measurable physical decay. Treating empirical biological failure as a socially constructed bias misreads the clinical nature of the intervention.</w:t>
+        <w:t xml:space="preserve">This objection confuses psychiatric variance with objective biological indicators. MDI thresholds are not determined by behavioral non-conformity; they are defined by critical thermoregulatory failure, advanced cachexia, profound sleep deprivation, and measurable physical decay. Treating empirical biological failure as a socially constructed bias misreads the clinical nature of the intervention. STC-65 acoustic decompression operates as a neurological ICU protocol: chronic cortisol toxicity degrades prefrontal tissue (Arnsten, 2009; McEwen, 2017), and silence within ASHRAE-compliant environmental parameters is the clinical intervention required to lower allostatic load, not punitive isolation.</w:t>
       </w:r>
     </w:p>
     <w:bookmarkEnd w:id="52"/>
@@ -1434,180 +1442,43 @@
       </w:r>
     </w:p>
     <w:bookmarkEnd w:id="54"/>
-    <w:bookmarkEnd w:id="55"/>
-    <w:bookmarkStart w:id="58" w:name="conclusion"/>
-    <w:p>
-      <w:pPr>
-        <w:pStyle w:val="Heading2"/>
-      </w:pPr>
-      <w:r>
-        <w:t xml:space="preserve">7. Conclusion</w:t>
-      </w:r>
-    </w:p>
-    <w:bookmarkStart w:id="56" w:name="summary-of-the-model-shift"/>
-    <w:p>
-      <w:pPr>
-        <w:pStyle w:val="Heading3"/>
-      </w:pPr>
-      <w:r>
-        <w:t xml:space="preserve">7.1 Summary of the Model Shift</w:t>
-      </w:r>
-    </w:p>
-    <w:p>
-      <w:pPr>
-        <w:pStyle w:val="FirstParagraph"/>
-      </w:pPr>
-      <w:r>
-        <w:t xml:space="preserve">Urban design provides the primary mechanism for arresting bodily decay among vulnerable populations (Westbrook &amp; Robinson, 2021). Before implementing sociological or programmatic interventions, municipalities must restructure public spaces to support physiological stabilization. Engineering survival infrastructure enables municipal authorities to rebuild the fragile material foundations required for human agency and long-term recovery.</w:t>
-      </w:r>
-    </w:p>
-    <w:p>
-      <w:pPr>
-        <w:pStyle w:val="BodyText"/>
-      </w:pPr>
-      <w:r>
-        <w:t xml:space="preserve">The current municipal approach to homelessness is a structural failure disguised as a social problem. By demanding programmatic compliance from individuals whose cognitive capacity has been dismantled by environmental trauma, cities guarantee the failure of their own programs. We must recognize that the body’s physical integrity is the prerequisite for any form of social or economic recovery.</w:t>
-      </w:r>
-    </w:p>
-    <w:p>
-      <w:pPr>
-        <w:pStyle w:val="BodyText"/>
-      </w:pPr>
-      <w:r>
-        <w:t xml:space="preserve">To build a humane and rational city, we must treat the physical environment as a moral variable. The design of our public spaces must reflect an understanding of human biology and thermodynamic needs. By deploying MDI and establishing a biological floor, we can halt the progressive decay of our most vulnerable citizens, rebuilding the material foundations of the social contract.</w:t>
-      </w:r>
-    </w:p>
-    <w:p>
-      <w:pPr>
-        <w:pStyle w:val="BodyText"/>
-      </w:pPr>
-      <w:r>
-        <w:t xml:space="preserve">This model shift requires a rejection of the voluntaristic housing models that dominate modern social policy. We must accept that when an individual’s cognitive agency has collapsed, the municipal government has a positive obligation to intervene, stabilize, and rebuild that agency. This commitment must be operationalized through permanent, standardized public infrastructure.</w:t>
-      </w:r>
-    </w:p>
-    <w:bookmarkEnd w:id="56"/>
-    <w:bookmarkStart w:id="57" w:name="future-research-directions"/>
-    <w:p>
-      <w:pPr>
-        <w:pStyle w:val="Heading3"/>
-      </w:pPr>
-      <w:r>
-        <w:t xml:space="preserve">7.2 Future Research Directions</w:t>
-      </w:r>
-    </w:p>
-    <w:p>
-      <w:pPr>
-        <w:pStyle w:val="FirstParagraph"/>
-      </w:pPr>
-      <w:r>
-        <w:t xml:space="preserve">The integration of neurobiology, thermodynamics, and urban planning represents a new field of study for social policy. Future research must focus on measuring the precise cognitive and physiological impacts of different physical environments. By conducting longitudinal studies of individuals in MDI installations, researchers can refine the engineering specifications for stabilization infrastructure.</w:t>
-      </w:r>
-    </w:p>
-    <w:p>
-      <w:pPr>
-        <w:pStyle w:val="BodyText"/>
-      </w:pPr>
-      <w:r>
-        <w:t xml:space="preserve">To measure these effects, researchers must track biomarkers of chronic stress, including cortisol and inflammatory cytokines, before and after placement in stabilization towers. Cognitive testing must evaluate changes in executive functioning, working memory, and decision-making capacity over time, documenting the rate of neurological recovery.</w:t>
-      </w:r>
-    </w:p>
-    <w:p>
-      <w:pPr>
-        <w:pStyle w:val="BodyText"/>
-      </w:pPr>
-      <w:r>
-        <w:t xml:space="preserve">Economists must develop broader models for evaluating the long-term fiscal benefits of preventative infrastructure. These models must account for the indirect savings in emergency healthcare, public protection, and tourism revenue. By demonstrating the long-term financial viability of MDI, social scientists and economists can collaborate to build the broad political and civic consensus necessary for large-scale municipal deployment across urban centers.</w:t>
-      </w:r>
-    </w:p>
-    <w:p>
-      <w:pPr>
-        <w:pStyle w:val="BodyText"/>
-      </w:pPr>
-      <w:r>
-        <w:t xml:space="preserve">The goal of this research is to establish design guidelines that make extreme precarity impossible. By engineering the city to support human biology, we can guarantee that the physical prerequisites of agency are protected for all, fulfilling the moral obligations of a civilized society.</w:t>
-      </w:r>
-    </w:p>
-    <w:bookmarkEnd w:id="57"/>
-    <w:bookmarkEnd w:id="58"/>
-    <w:bookmarkStart w:id="62" w:name="declarations"/>
-    <w:p>
-      <w:pPr>
-        <w:pStyle w:val="Heading2"/>
-      </w:pPr>
-      <w:r>
-        <w:t xml:space="preserve">Declarations</w:t>
-      </w:r>
-    </w:p>
-    <w:bookmarkStart w:id="59" w:name="funding"/>
-    <w:p>
-      <w:pPr>
-        <w:pStyle w:val="Heading3"/>
-      </w:pPr>
-      <w:r>
-        <w:t xml:space="preserve">Funding</w:t>
-      </w:r>
-    </w:p>
-    <w:p>
-      <w:pPr>
-        <w:pStyle w:val="FirstParagraph"/>
-      </w:pPr>
-      <w:r>
-        <w:t xml:space="preserve">This work received no grant from any funding agency in the public, commercial, or not-for-profit sectors.</w:t>
-      </w:r>
-    </w:p>
-    <w:bookmarkEnd w:id="59"/>
-    <w:bookmarkStart w:id="60" w:name="disclosure-statement"/>
-    <w:p>
-      <w:pPr>
-        <w:pStyle w:val="Heading3"/>
-      </w:pPr>
-      <w:r>
-        <w:t xml:space="preserve">Disclosure Statement</w:t>
-      </w:r>
-    </w:p>
-    <w:p>
-      <w:pPr>
-        <w:pStyle w:val="FirstParagraph"/>
-      </w:pPr>
-      <w:r>
-        <w:t xml:space="preserve">No potential conflict of interest was reported by the authors.</w:t>
-      </w:r>
-    </w:p>
-    <w:bookmarkEnd w:id="60"/>
-    <w:bookmarkStart w:id="61" w:name="data-availability-statement"/>
-    <w:p>
-      <w:pPr>
-        <w:pStyle w:val="Heading3"/>
-      </w:pPr>
-      <w:r>
-        <w:t xml:space="preserve">Data Availability Statement</w:t>
-      </w:r>
-    </w:p>
-    <w:p>
-      <w:pPr>
-        <w:pStyle w:val="FirstParagraph"/>
-      </w:pPr>
-      <w:r>
-        <w:t xml:space="preserve">Data sharing is not applicable to this article as no new datasets were created or analyzed.</w:t>
-      </w:r>
-    </w:p>
-    <w:bookmarkEnd w:id="61"/>
-    <w:bookmarkEnd w:id="62"/>
-    <w:bookmarkStart w:id="63" w:name="references"/>
-    <w:p>
-      <w:pPr>
-        <w:pStyle w:val="Heading2"/>
-      </w:pPr>
-      <w:r>
-        <w:t xml:space="preserve">References</w:t>
-      </w:r>
-    </w:p>
-    <w:p>
-      <w:pPr>
-        <w:pStyle w:val="FirstParagraph"/>
-      </w:pPr>
-      <w:r>
-        <w:t xml:space="preserve">Appelbaum, P. S. (1994).</w:t>
+    <w:bookmarkStart w:id="55" w:name="the-predator-victim-binary-fallacy"/>
+    <w:p>
+      <w:pPr>
+        <w:pStyle w:val="Heading3"/>
+      </w:pPr>
+      <w:r>
+        <w:t xml:space="preserve">6.9 The Predator-Victim Binary Fallacy</w:t>
+      </w:r>
+    </w:p>
+    <w:p>
+      <w:pPr>
+        <w:pStyle w:val="FirstParagraph"/>
+      </w:pPr>
+      <w:r>
+        <w:rPr>
+          <w:bCs/>
+          <w:b/>
+        </w:rPr>
+        <w:t xml:space="preserve">Objection</w:t>
+      </w:r>
+      <w:r>
+        <w:t xml:space="preserve">: Separating street populations into defenseless casualties and predatory exploiters oversimplifies survival economics and justifies carceral sweeps under the guise of medical extraction.</w:t>
+      </w:r>
+    </w:p>
+    <w:p>
+      <w:pPr>
+        <w:pStyle w:val="BodyText"/>
+      </w:pPr>
+      <w:r>
+        <w:rPr>
+          <w:bCs/>
+          <w:b/>
+        </w:rPr>
+        <w:t xml:space="preserve">Error Vector</w:t>
+      </w:r>
+      <w:r>
+        <w:t xml:space="preserve">:</w:t>
       </w:r>
       <w:r>
         <w:t xml:space="preserve"> </w:t>
@@ -1617,18 +1488,53 @@
           <w:iCs/>
           <w:i/>
         </w:rPr>
-        <w:t xml:space="preserve">Almost a revolution: Mental health law and the limits of change</w:t>
-      </w:r>
-      <w:r>
-        <w:t xml:space="preserve">. Oxford University Press.</w:t>
-      </w:r>
-    </w:p>
-    <w:p>
-      <w:pPr>
-        <w:pStyle w:val="BodyText"/>
-      </w:pPr>
-      <w:r>
-        <w:t xml:space="preserve">Aravena, A. (2016).</w:t>
+        <w:t xml:space="preserve">Confusing Predation with Subsistence</w:t>
+      </w:r>
+      <w:r>
+        <w:t xml:space="preserve"> </w:t>
+      </w:r>
+      <w:r>
+        <w:t xml:space="preserve">This objection treats narcotics distribution and sexual exploitation as survival behavior equivalent to panhandling or scavenging. Routine Activity Theory (Cohen &amp; Felson, 1979) establishes that crime requires a motivated offender, a suitable target, and the absence of a capable guardian. Encampments concentrate neurologically defenseless targets in unguarded space, creating an optimal predator marketplace. When MDI extracts the victim population, the predator economy loses its captive customer base, its human camouflage, and its reason to congregate. Crime Prevention Through Environmental Design (Jeffery, 1971) confirms that altering the spatial conditions of predation collapses the predatory structure without requiring expanded policing.</w:t>
+      </w:r>
+    </w:p>
+    <w:bookmarkEnd w:id="55"/>
+    <w:bookmarkStart w:id="56" w:name="the-silver-bullet-fallacy"/>
+    <w:p>
+      <w:pPr>
+        <w:pStyle w:val="Heading3"/>
+      </w:pPr>
+      <w:r>
+        <w:t xml:space="preserve">6.10 The Silver Bullet Fallacy</w:t>
+      </w:r>
+    </w:p>
+    <w:p>
+      <w:pPr>
+        <w:pStyle w:val="FirstParagraph"/>
+      </w:pPr>
+      <w:r>
+        <w:rPr>
+          <w:bCs/>
+          <w:b/>
+        </w:rPr>
+        <w:t xml:space="preserve">Objection</w:t>
+      </w:r>
+      <w:r>
+        <w:t xml:space="preserve">: Homelessness is a multi-dimensional crisis rooted in housing markets, structural racism, psychiatric illness, and deindustrialization. Proposing a single engineering intervention ignores social complexity.</w:t>
+      </w:r>
+    </w:p>
+    <w:p>
+      <w:pPr>
+        <w:pStyle w:val="BodyText"/>
+      </w:pPr>
+      <w:r>
+        <w:rPr>
+          <w:bCs/>
+          <w:b/>
+        </w:rPr>
+        <w:t xml:space="preserve">Error Vector</w:t>
+      </w:r>
+      <w:r>
+        <w:t xml:space="preserve">:</w:t>
       </w:r>
       <w:r>
         <w:t xml:space="preserve"> </w:t>
@@ -1638,18 +1544,190 @@
           <w:iCs/>
           <w:i/>
         </w:rPr>
-        <w:t xml:space="preserve">Elemental: Incremental housing and participatory design manual</w:t>
-      </w:r>
-      <w:r>
-        <w:t xml:space="preserve">. Hatje Cantz.</w:t>
-      </w:r>
-    </w:p>
-    <w:p>
-      <w:pPr>
-        <w:pStyle w:val="BodyText"/>
-      </w:pPr>
-      <w:r>
-        <w:t xml:space="preserve">Arnsten, A. F. (2009). Stress signalling pathways that impair prefrontal cortex structure and function.</w:t>
+        <w:t xml:space="preserve">Conflating Prerequisites with Complete Solutions</w:t>
+      </w:r>
+      <w:r>
+        <w:t xml:space="preserve"> </w:t>
+      </w:r>
+      <w:r>
+        <w:t xml:space="preserve">This objection uses structural complexity to justify administrative paralysis. MDI does not claim to resolve long-term economic inequality or psychiatric disorders. It restores the biological floor required for all subsequent social programs to function. Phase Zero metabolic stabilization is a prerequisite, not a replacement: without restored prefrontal cortex function, the target cohort lacks the neurological capacity to participate in housing programs, vocational training, or therapeutic intervention. Treating a baseline biological prerequisite as a silver-bullet illusion guarantees continued lethal drift.</w:t>
+      </w:r>
+    </w:p>
+    <w:bookmarkEnd w:id="56"/>
+    <w:bookmarkEnd w:id="57"/>
+    <w:bookmarkStart w:id="60" w:name="conclusion"/>
+    <w:p>
+      <w:pPr>
+        <w:pStyle w:val="Heading2"/>
+      </w:pPr>
+      <w:r>
+        <w:t xml:space="preserve">7. Conclusion</w:t>
+      </w:r>
+    </w:p>
+    <w:bookmarkStart w:id="58" w:name="summary-of-the-model-shift"/>
+    <w:p>
+      <w:pPr>
+        <w:pStyle w:val="Heading3"/>
+      </w:pPr>
+      <w:r>
+        <w:t xml:space="preserve">7.1 Summary of the Model Shift</w:t>
+      </w:r>
+    </w:p>
+    <w:p>
+      <w:pPr>
+        <w:pStyle w:val="FirstParagraph"/>
+      </w:pPr>
+      <w:r>
+        <w:t xml:space="preserve">Urban design provides the primary mechanism for arresting bodily decay among vulnerable populations (Westbrook &amp; Robinson, 2021). Before implementing sociological or programmatic interventions, municipalities must restructure public spaces to support physiological stabilization. Engineering survival infrastructure enables municipal authorities to rebuild the fragile material foundations required for human agency and long-term recovery.</w:t>
+      </w:r>
+    </w:p>
+    <w:p>
+      <w:pPr>
+        <w:pStyle w:val="BodyText"/>
+      </w:pPr>
+      <w:r>
+        <w:t xml:space="preserve">The current municipal approach to homelessness is a structural failure disguised as a social problem. By demanding programmatic compliance from individuals whose cognitive capacity has been dismantled by environmental trauma, cities guarantee the failure of their own programs. We must recognize that the body’s physical integrity is the prerequisite for any form of social or economic recovery.</w:t>
+      </w:r>
+    </w:p>
+    <w:p>
+      <w:pPr>
+        <w:pStyle w:val="BodyText"/>
+      </w:pPr>
+      <w:r>
+        <w:t xml:space="preserve">To build a humane and rational city, we must treat the physical environment as a moral variable. The design of our public spaces must reflect an understanding of human biology and thermodynamic needs. By deploying MDI and establishing a biological floor, we can halt the progressive decay of our most vulnerable citizens, rebuilding the material foundations of the social contract.</w:t>
+      </w:r>
+    </w:p>
+    <w:p>
+      <w:pPr>
+        <w:pStyle w:val="BodyText"/>
+      </w:pPr>
+      <w:r>
+        <w:t xml:space="preserve">This model shift requires a rejection of the voluntaristic housing models that dominate modern social policy. We must accept that when an individual’s cognitive agency has collapsed, the municipal government has a positive obligation to intervene, stabilize, and rebuild that agency. This commitment must be operationalized through permanent, standardized public infrastructure.</w:t>
+      </w:r>
+    </w:p>
+    <w:bookmarkEnd w:id="58"/>
+    <w:bookmarkStart w:id="59" w:name="future-research-directions"/>
+    <w:p>
+      <w:pPr>
+        <w:pStyle w:val="Heading3"/>
+      </w:pPr>
+      <w:r>
+        <w:t xml:space="preserve">7.2 Future Research Directions</w:t>
+      </w:r>
+    </w:p>
+    <w:p>
+      <w:pPr>
+        <w:pStyle w:val="FirstParagraph"/>
+      </w:pPr>
+      <w:r>
+        <w:t xml:space="preserve">The integration of neurobiology, thermodynamics, and urban planning represents a new field of study for social policy. Future research must focus on measuring the precise cognitive and physiological impacts of different physical environments. By conducting longitudinal studies of individuals in MDI installations, researchers can refine the engineering specifications for stabilization infrastructure.</w:t>
+      </w:r>
+    </w:p>
+    <w:p>
+      <w:pPr>
+        <w:pStyle w:val="BodyText"/>
+      </w:pPr>
+      <w:r>
+        <w:t xml:space="preserve">To measure these effects, researchers must track biomarkers of chronic stress, including cortisol and inflammatory cytokines, before and after placement in stabilization towers. Cognitive testing must evaluate changes in executive functioning, working memory, and decision-making capacity over time, documenting the rate of neurological recovery.</w:t>
+      </w:r>
+    </w:p>
+    <w:p>
+      <w:pPr>
+        <w:pStyle w:val="BodyText"/>
+      </w:pPr>
+      <w:r>
+        <w:t xml:space="preserve">Economists must develop broader models for evaluating the long-term fiscal benefits of preventative infrastructure. These models must account for the indirect savings in emergency healthcare, public protection, and tourism revenue. By demonstrating the long-term financial viability of MDI, social scientists and economists can collaborate to build the broad political and civic consensus necessary for large-scale municipal deployment across urban centers.</w:t>
+      </w:r>
+    </w:p>
+    <w:p>
+      <w:pPr>
+        <w:pStyle w:val="BodyText"/>
+      </w:pPr>
+      <w:r>
+        <w:t xml:space="preserve">The goal of this research is to establish design guidelines that make extreme precarity impossible. By engineering the city to support human biology, we can guarantee that the physical prerequisites of agency are protected for all, fulfilling the moral obligations of a civilized society.</w:t>
+      </w:r>
+    </w:p>
+    <w:bookmarkEnd w:id="59"/>
+    <w:bookmarkEnd w:id="60"/>
+    <w:bookmarkStart w:id="64" w:name="declarations"/>
+    <w:p>
+      <w:pPr>
+        <w:pStyle w:val="Heading2"/>
+      </w:pPr>
+      <w:r>
+        <w:t xml:space="preserve">Declarations</w:t>
+      </w:r>
+    </w:p>
+    <w:bookmarkStart w:id="61" w:name="funding"/>
+    <w:p>
+      <w:pPr>
+        <w:pStyle w:val="Heading3"/>
+      </w:pPr>
+      <w:r>
+        <w:t xml:space="preserve">Funding</w:t>
+      </w:r>
+    </w:p>
+    <w:p>
+      <w:pPr>
+        <w:pStyle w:val="FirstParagraph"/>
+      </w:pPr>
+      <w:r>
+        <w:t xml:space="preserve">This work received no grant from any funding agency in the public, commercial, or not-for-profit sectors.</w:t>
+      </w:r>
+    </w:p>
+    <w:bookmarkEnd w:id="61"/>
+    <w:bookmarkStart w:id="62" w:name="disclosure-statement"/>
+    <w:p>
+      <w:pPr>
+        <w:pStyle w:val="Heading3"/>
+      </w:pPr>
+      <w:r>
+        <w:t xml:space="preserve">Disclosure Statement</w:t>
+      </w:r>
+    </w:p>
+    <w:p>
+      <w:pPr>
+        <w:pStyle w:val="FirstParagraph"/>
+      </w:pPr>
+      <w:r>
+        <w:t xml:space="preserve">No potential conflict of interest was reported by the authors.</w:t>
+      </w:r>
+    </w:p>
+    <w:bookmarkEnd w:id="62"/>
+    <w:bookmarkStart w:id="63" w:name="data-availability-statement"/>
+    <w:p>
+      <w:pPr>
+        <w:pStyle w:val="Heading3"/>
+      </w:pPr>
+      <w:r>
+        <w:t xml:space="preserve">Data Availability Statement</w:t>
+      </w:r>
+    </w:p>
+    <w:p>
+      <w:pPr>
+        <w:pStyle w:val="FirstParagraph"/>
+      </w:pPr>
+      <w:r>
+        <w:t xml:space="preserve">Data sharing is not applicable to this article as no new datasets were created or analyzed.</w:t>
+      </w:r>
+    </w:p>
+    <w:bookmarkEnd w:id="63"/>
+    <w:bookmarkEnd w:id="64"/>
+    <w:bookmarkStart w:id="65" w:name="references"/>
+    <w:p>
+      <w:pPr>
+        <w:pStyle w:val="Heading2"/>
+      </w:pPr>
+      <w:r>
+        <w:t xml:space="preserve">References</w:t>
+      </w:r>
+    </w:p>
+    <w:p>
+      <w:pPr>
+        <w:pStyle w:val="FirstParagraph"/>
+      </w:pPr>
+      <w:r>
+        <w:t xml:space="preserve">Appelbaum, P. S. (1994).</w:t>
       </w:r>
       <w:r>
         <w:t xml:space="preserve"> </w:t>
@@ -1659,18 +1737,18 @@
           <w:iCs/>
           <w:i/>
         </w:rPr>
-        <w:t xml:space="preserve">Nature Reviews Neuroscience</w:t>
-      </w:r>
-      <w:r>
-        <w:t xml:space="preserve">, 10(6), 410-422.</w:t>
-      </w:r>
-    </w:p>
-    <w:p>
-      <w:pPr>
-        <w:pStyle w:val="BodyText"/>
-      </w:pPr>
-      <w:r>
-        <w:t xml:space="preserve">ASCE. (2022).</w:t>
+        <w:t xml:space="preserve">Almost a revolution: Mental health law and the limits of change</w:t>
+      </w:r>
+      <w:r>
+        <w:t xml:space="preserve">. Oxford University Press.</w:t>
+      </w:r>
+    </w:p>
+    <w:p>
+      <w:pPr>
+        <w:pStyle w:val="BodyText"/>
+      </w:pPr>
+      <w:r>
+        <w:t xml:space="preserve">Aravena, A. (2016).</w:t>
       </w:r>
       <w:r>
         <w:t xml:space="preserve"> </w:t>
@@ -1680,21 +1758,18 @@
           <w:iCs/>
           <w:i/>
         </w:rPr>
-        <w:t xml:space="preserve">Minimum design loads and associated criteria for buildings and other structures</w:t>
-      </w:r>
-      <w:r>
-        <w:t xml:space="preserve"> </w:t>
-      </w:r>
-      <w:r>
-        <w:t xml:space="preserve">(ASCE/SEI 7-22). American Society of Civil Engineers.</w:t>
-      </w:r>
-    </w:p>
-    <w:p>
-      <w:pPr>
-        <w:pStyle w:val="BodyText"/>
-      </w:pPr>
-      <w:r>
-        <w:t xml:space="preserve">ASHRAE. (2019).</w:t>
+        <w:t xml:space="preserve">Elemental: Incremental housing and participatory design manual</w:t>
+      </w:r>
+      <w:r>
+        <w:t xml:space="preserve">. Hatje Cantz.</w:t>
+      </w:r>
+    </w:p>
+    <w:p>
+      <w:pPr>
+        <w:pStyle w:val="BodyText"/>
+      </w:pPr>
+      <w:r>
+        <w:t xml:space="preserve">Arnsten, A. F. (2009). Stress signalling pathways that impair prefrontal cortex structure and function.</w:t>
       </w:r>
       <w:r>
         <w:t xml:space="preserve"> </w:t>
@@ -1704,21 +1779,18 @@
           <w:iCs/>
           <w:i/>
         </w:rPr>
-        <w:t xml:space="preserve">Ventilation for acceptable indoor air quality</w:t>
-      </w:r>
-      <w:r>
-        <w:t xml:space="preserve"> </w:t>
-      </w:r>
-      <w:r>
-        <w:t xml:space="preserve">(Standard 62.1-2019). American Society of Heating, Refrigerating and Air-Conditioning Engineers.</w:t>
-      </w:r>
-    </w:p>
-    <w:p>
-      <w:pPr>
-        <w:pStyle w:val="BodyText"/>
-      </w:pPr>
-      <w:r>
-        <w:t xml:space="preserve">Batterham, D. (2020). Homelessness as capability deprivation: A conceptual model.</w:t>
+        <w:t xml:space="preserve">Nature Reviews Neuroscience</w:t>
+      </w:r>
+      <w:r>
+        <w:t xml:space="preserve">, 10(6), 410-422.</w:t>
+      </w:r>
+    </w:p>
+    <w:p>
+      <w:pPr>
+        <w:pStyle w:val="BodyText"/>
+      </w:pPr>
+      <w:r>
+        <w:t xml:space="preserve">ASCE. (2022).</w:t>
       </w:r>
       <w:r>
         <w:t xml:space="preserve"> </w:t>
@@ -1728,18 +1800,21 @@
           <w:iCs/>
           <w:i/>
         </w:rPr>
-        <w:t xml:space="preserve">Housing, Theory and Society</w:t>
-      </w:r>
-      <w:r>
-        <w:t xml:space="preserve">, 37(3), 274-297.</w:t>
-      </w:r>
-    </w:p>
-    <w:p>
-      <w:pPr>
-        <w:pStyle w:val="BodyText"/>
-      </w:pPr>
-      <w:r>
-        <w:t xml:space="preserve">Crocker, D. A. (2008).</w:t>
+        <w:t xml:space="preserve">Minimum design loads and associated criteria for buildings and other structures</w:t>
+      </w:r>
+      <w:r>
+        <w:t xml:space="preserve"> </w:t>
+      </w:r>
+      <w:r>
+        <w:t xml:space="preserve">(ASCE/SEI 7-22). American Society of Civil Engineers.</w:t>
+      </w:r>
+    </w:p>
+    <w:p>
+      <w:pPr>
+        <w:pStyle w:val="BodyText"/>
+      </w:pPr>
+      <w:r>
+        <w:t xml:space="preserve">ASHRAE. (2019).</w:t>
       </w:r>
       <w:r>
         <w:t xml:space="preserve"> </w:t>
@@ -1749,18 +1824,21 @@
           <w:iCs/>
           <w:i/>
         </w:rPr>
-        <w:t xml:space="preserve">Ethics of global development: Agency, capability, and deliberative democracy</w:t>
-      </w:r>
-      <w:r>
-        <w:t xml:space="preserve">. Cambridge University Press.</w:t>
-      </w:r>
-    </w:p>
-    <w:p>
-      <w:pPr>
-        <w:pStyle w:val="BodyText"/>
-      </w:pPr>
-      <w:r>
-        <w:t xml:space="preserve">DeVerteuil, G. (2015).</w:t>
+        <w:t xml:space="preserve">Ventilation for acceptable indoor air quality</w:t>
+      </w:r>
+      <w:r>
+        <w:t xml:space="preserve"> </w:t>
+      </w:r>
+      <w:r>
+        <w:t xml:space="preserve">(Standard 62.1-2019). American Society of Heating, Refrigerating and Air-Conditioning Engineers.</w:t>
+      </w:r>
+    </w:p>
+    <w:p>
+      <w:pPr>
+        <w:pStyle w:val="BodyText"/>
+      </w:pPr>
+      <w:r>
+        <w:t xml:space="preserve">Cohen, L. E., &amp; Felson, M. (1979). Social change and crime rate trends: A routine activity approach.</w:t>
       </w:r>
       <w:r>
         <w:t xml:space="preserve"> </w:t>
@@ -1770,18 +1848,18 @@
           <w:iCs/>
           <w:i/>
         </w:rPr>
-        <w:t xml:space="preserve">Resilience in the post-welfare inner city: Voluntary sector geographies in London, Los Angeles and Sydney</w:t>
-      </w:r>
-      <w:r>
-        <w:t xml:space="preserve">. Policy Press.</w:t>
-      </w:r>
-    </w:p>
-    <w:p>
-      <w:pPr>
-        <w:pStyle w:val="BodyText"/>
-      </w:pPr>
-      <w:r>
-        <w:t xml:space="preserve">Gowan, T. (2010).</w:t>
+        <w:t xml:space="preserve">American Sociological Review</w:t>
+      </w:r>
+      <w:r>
+        <w:t xml:space="preserve">, 44(4), 588-608.</w:t>
+      </w:r>
+    </w:p>
+    <w:p>
+      <w:pPr>
+        <w:pStyle w:val="BodyText"/>
+      </w:pPr>
+      <w:r>
+        <w:t xml:space="preserve">Batterham, D. (2020). Homelessness as capability deprivation: A conceptual model.</w:t>
       </w:r>
       <w:r>
         <w:t xml:space="preserve"> </w:t>
@@ -1791,18 +1869,18 @@
           <w:iCs/>
           <w:i/>
         </w:rPr>
-        <w:t xml:space="preserve">Hobos, hustlers, and backsliders: Homeless in San Francisco</w:t>
-      </w:r>
-      <w:r>
-        <w:t xml:space="preserve">. University of Minnesota Press.</w:t>
-      </w:r>
-    </w:p>
-    <w:p>
-      <w:pPr>
-        <w:pStyle w:val="BodyText"/>
-      </w:pPr>
-      <w:r>
-        <w:t xml:space="preserve">Maritain, J. (1951).</w:t>
+        <w:t xml:space="preserve">Housing, Theory and Society</w:t>
+      </w:r>
+      <w:r>
+        <w:t xml:space="preserve">, 37(3), 274-297.</w:t>
+      </w:r>
+    </w:p>
+    <w:p>
+      <w:pPr>
+        <w:pStyle w:val="BodyText"/>
+      </w:pPr>
+      <w:r>
+        <w:t xml:space="preserve">Crocker, D. A. (2008).</w:t>
       </w:r>
       <w:r>
         <w:t xml:space="preserve"> </w:t>
@@ -1812,18 +1890,18 @@
           <w:iCs/>
           <w:i/>
         </w:rPr>
-        <w:t xml:space="preserve">Man and the state</w:t>
-      </w:r>
-      <w:r>
-        <w:t xml:space="preserve">. University of Chicago Press.</w:t>
-      </w:r>
-    </w:p>
-    <w:p>
-      <w:pPr>
-        <w:pStyle w:val="BodyText"/>
-      </w:pPr>
-      <w:r>
-        <w:t xml:space="preserve">McEwen, B. S. (2017). Neurobiological and systemic effects of chronic stress.</w:t>
+        <w:t xml:space="preserve">Ethics of global development: Agency, capability, and deliberative democracy</w:t>
+      </w:r>
+      <w:r>
+        <w:t xml:space="preserve">. Cambridge University Press.</w:t>
+      </w:r>
+    </w:p>
+    <w:p>
+      <w:pPr>
+        <w:pStyle w:val="BodyText"/>
+      </w:pPr>
+      <w:r>
+        <w:t xml:space="preserve">DeVerteuil, G. (2015).</w:t>
       </w:r>
       <w:r>
         <w:t xml:space="preserve"> </w:t>
@@ -1833,18 +1911,18 @@
           <w:iCs/>
           <w:i/>
         </w:rPr>
-        <w:t xml:space="preserve">Chronic Stress</w:t>
-      </w:r>
-      <w:r>
-        <w:t xml:space="preserve">, 1.</w:t>
-      </w:r>
-    </w:p>
-    <w:p>
-      <w:pPr>
-        <w:pStyle w:val="BodyText"/>
-      </w:pPr>
-      <w:r>
-        <w:t xml:space="preserve">Mitchell, D. (1997). The annihilation of space by law: The anti-homeless laws and the shrinking of public space in American cities.</w:t>
+        <w:t xml:space="preserve">Resilience in the post-welfare inner city: Voluntary sector geographies in London, Los Angeles and Sydney</w:t>
+      </w:r>
+      <w:r>
+        <w:t xml:space="preserve">. Policy Press.</w:t>
+      </w:r>
+    </w:p>
+    <w:p>
+      <w:pPr>
+        <w:pStyle w:val="BodyText"/>
+      </w:pPr>
+      <w:r>
+        <w:t xml:space="preserve">Gowan, T. (2010).</w:t>
       </w:r>
       <w:r>
         <w:t xml:space="preserve"> </w:t>
@@ -1854,18 +1932,18 @@
           <w:iCs/>
           <w:i/>
         </w:rPr>
-        <w:t xml:space="preserve">Antipode</w:t>
-      </w:r>
-      <w:r>
-        <w:t xml:space="preserve">, 29(3), 303–335.</w:t>
-      </w:r>
-    </w:p>
-    <w:p>
-      <w:pPr>
-        <w:pStyle w:val="BodyText"/>
-      </w:pPr>
-      <w:r>
-        <w:t xml:space="preserve">Nussbaum, M. C. (2011).</w:t>
+        <w:t xml:space="preserve">Hobos, hustlers, and backsliders: Homeless in San Francisco</w:t>
+      </w:r>
+      <w:r>
+        <w:t xml:space="preserve">. University of Minnesota Press.</w:t>
+      </w:r>
+    </w:p>
+    <w:p>
+      <w:pPr>
+        <w:pStyle w:val="BodyText"/>
+      </w:pPr>
+      <w:r>
+        <w:t xml:space="preserve">Jeffery, C. R. (1971).</w:t>
       </w:r>
       <w:r>
         <w:t xml:space="preserve"> </w:t>
@@ -1875,18 +1953,18 @@
           <w:iCs/>
           <w:i/>
         </w:rPr>
-        <w:t xml:space="preserve">Creating capabilities: The human development approach</w:t>
-      </w:r>
-      <w:r>
-        <w:t xml:space="preserve">. Harvard University Press.</w:t>
-      </w:r>
-    </w:p>
-    <w:p>
-      <w:pPr>
-        <w:pStyle w:val="BodyText"/>
-      </w:pPr>
-      <w:r>
-        <w:t xml:space="preserve">Roth, M. (2001). Guardianship and the least restrictive alternative.</w:t>
+        <w:t xml:space="preserve">Crime prevention through environmental design</w:t>
+      </w:r>
+      <w:r>
+        <w:t xml:space="preserve">. Sage Publications.</w:t>
+      </w:r>
+    </w:p>
+    <w:p>
+      <w:pPr>
+        <w:pStyle w:val="BodyText"/>
+      </w:pPr>
+      <w:r>
+        <w:t xml:space="preserve">Maritain, J. (1951).</w:t>
       </w:r>
       <w:r>
         <w:t xml:space="preserve"> </w:t>
@@ -1896,18 +1974,18 @@
           <w:iCs/>
           <w:i/>
         </w:rPr>
-        <w:t xml:space="preserve">Journal of Health Politics, Policy and Law</w:t>
-      </w:r>
-      <w:r>
-        <w:t xml:space="preserve">, 26(3), 603-625.</w:t>
-      </w:r>
-    </w:p>
-    <w:p>
-      <w:pPr>
-        <w:pStyle w:val="BodyText"/>
-      </w:pPr>
-      <w:r>
-        <w:t xml:space="preserve">Sapolsky, R. M. (2004).</w:t>
+        <w:t xml:space="preserve">Man and the state</w:t>
+      </w:r>
+      <w:r>
+        <w:t xml:space="preserve">. University of Chicago Press.</w:t>
+      </w:r>
+    </w:p>
+    <w:p>
+      <w:pPr>
+        <w:pStyle w:val="BodyText"/>
+      </w:pPr>
+      <w:r>
+        <w:t xml:space="preserve">McEwen, B. S. (2017). Neurobiological and systemic effects of chronic stress.</w:t>
       </w:r>
       <w:r>
         <w:t xml:space="preserve"> </w:t>
@@ -1917,18 +1995,18 @@
           <w:iCs/>
           <w:i/>
         </w:rPr>
-        <w:t xml:space="preserve">Why zebras don’t get ulcers</w:t>
-      </w:r>
-      <w:r>
-        <w:t xml:space="preserve">. Holt Paperbacks.</w:t>
-      </w:r>
-    </w:p>
-    <w:p>
-      <w:pPr>
-        <w:pStyle w:val="BodyText"/>
-      </w:pPr>
-      <w:r>
-        <w:t xml:space="preserve">Sen, A. (1999).</w:t>
+        <w:t xml:space="preserve">Chronic Stress</w:t>
+      </w:r>
+      <w:r>
+        <w:t xml:space="preserve">, 1.</w:t>
+      </w:r>
+    </w:p>
+    <w:p>
+      <w:pPr>
+        <w:pStyle w:val="BodyText"/>
+      </w:pPr>
+      <w:r>
+        <w:t xml:space="preserve">Mitchell, D. (1997). The annihilation of space by law: The anti-homeless laws and the shrinking of public space in American cities.</w:t>
       </w:r>
       <w:r>
         <w:t xml:space="preserve"> </w:t>
@@ -1938,18 +2016,18 @@
           <w:iCs/>
           <w:i/>
         </w:rPr>
-        <w:t xml:space="preserve">Development as freedom</w:t>
-      </w:r>
-      <w:r>
-        <w:t xml:space="preserve">. Oxford University Press.</w:t>
-      </w:r>
-    </w:p>
-    <w:p>
-      <w:pPr>
-        <w:pStyle w:val="BodyText"/>
-      </w:pPr>
-      <w:r>
-        <w:t xml:space="preserve">Szasz, T. S. (1960). The myth of mental illness.</w:t>
+        <w:t xml:space="preserve">Antipode</w:t>
+      </w:r>
+      <w:r>
+        <w:t xml:space="preserve">, 29(3), 303-335.</w:t>
+      </w:r>
+    </w:p>
+    <w:p>
+      <w:pPr>
+        <w:pStyle w:val="BodyText"/>
+      </w:pPr>
+      <w:r>
+        <w:t xml:space="preserve">Newman, O. (1972).</w:t>
       </w:r>
       <w:r>
         <w:t xml:space="preserve"> </w:t>
@@ -1959,18 +2037,18 @@
           <w:iCs/>
           <w:i/>
         </w:rPr>
-        <w:t xml:space="preserve">American Psychologist</w:t>
-      </w:r>
-      <w:r>
-        <w:t xml:space="preserve">, 15(2), 113-118.</w:t>
-      </w:r>
-    </w:p>
-    <w:p>
-      <w:pPr>
-        <w:pStyle w:val="BodyText"/>
-      </w:pPr>
-      <w:r>
-        <w:t xml:space="preserve">Tsemberis, S., Gulcur, L., &amp; Nakae, M. (2004). Housing First, consumer choice, and harm reduction for individuals who are homeless and have co-occurring disorders.</w:t>
+        <w:t xml:space="preserve">Defensible space: Crime prevention through urban design</w:t>
+      </w:r>
+      <w:r>
+        <w:t xml:space="preserve">. Macmillan.</w:t>
+      </w:r>
+    </w:p>
+    <w:p>
+      <w:pPr>
+        <w:pStyle w:val="BodyText"/>
+      </w:pPr>
+      <w:r>
+        <w:t xml:space="preserve">Nussbaum, M. C. (2011).</w:t>
       </w:r>
       <w:r>
         <w:t xml:space="preserve"> </w:t>
@@ -1980,18 +2058,18 @@
           <w:iCs/>
           <w:i/>
         </w:rPr>
-        <w:t xml:space="preserve">American Journal of Public Health</w:t>
-      </w:r>
-      <w:r>
-        <w:t xml:space="preserve">, 94(4), 651–656.</w:t>
-      </w:r>
-    </w:p>
-    <w:p>
-      <w:pPr>
-        <w:pStyle w:val="BodyText"/>
-      </w:pPr>
-      <w:r>
-        <w:t xml:space="preserve">Walker, M. (2017).</w:t>
+        <w:t xml:space="preserve">Creating capabilities: The human development approach</w:t>
+      </w:r>
+      <w:r>
+        <w:t xml:space="preserve">. Harvard University Press.</w:t>
+      </w:r>
+    </w:p>
+    <w:p>
+      <w:pPr>
+        <w:pStyle w:val="BodyText"/>
+      </w:pPr>
+      <w:r>
+        <w:t xml:space="preserve">Roth, M. (2001). Guardianship and the least restrictive alternative.</w:t>
       </w:r>
       <w:r>
         <w:t xml:space="preserve"> </w:t>
@@ -2001,18 +2079,18 @@
           <w:iCs/>
           <w:i/>
         </w:rPr>
-        <w:t xml:space="preserve">Why we sleep: Unlocking the power of sleep and dreams</w:t>
-      </w:r>
-      <w:r>
-        <w:t xml:space="preserve">. Simon and Schuster.</w:t>
-      </w:r>
-    </w:p>
-    <w:p>
-      <w:pPr>
-        <w:pStyle w:val="BodyText"/>
-      </w:pPr>
-      <w:r>
-        <w:t xml:space="preserve">Westbrook, M., &amp; Robinson, T. (2021). Unhealthy by design: Health and safety consequences of the criminalization of homelessness.</w:t>
+        <w:t xml:space="preserve">Journal of Health Politics, Policy and Law</w:t>
+      </w:r>
+      <w:r>
+        <w:t xml:space="preserve">, 26(3), 603-625.</w:t>
+      </w:r>
+    </w:p>
+    <w:p>
+      <w:pPr>
+        <w:pStyle w:val="BodyText"/>
+      </w:pPr>
+      <w:r>
+        <w:t xml:space="preserve">Sapolsky, R. M. (2004).</w:t>
       </w:r>
       <w:r>
         <w:t xml:space="preserve"> </w:t>
@@ -2022,14 +2100,119 @@
           <w:iCs/>
           <w:i/>
         </w:rPr>
+        <w:t xml:space="preserve">Why zebras don’t get ulcers</w:t>
+      </w:r>
+      <w:r>
+        <w:t xml:space="preserve">. Holt Paperbacks.</w:t>
+      </w:r>
+    </w:p>
+    <w:p>
+      <w:pPr>
+        <w:pStyle w:val="BodyText"/>
+      </w:pPr>
+      <w:r>
+        <w:t xml:space="preserve">Sen, A. (1999).</w:t>
+      </w:r>
+      <w:r>
+        <w:t xml:space="preserve"> </w:t>
+      </w:r>
+      <w:r>
+        <w:rPr>
+          <w:iCs/>
+          <w:i/>
+        </w:rPr>
+        <w:t xml:space="preserve">Development as freedom</w:t>
+      </w:r>
+      <w:r>
+        <w:t xml:space="preserve">. Oxford University Press.</w:t>
+      </w:r>
+    </w:p>
+    <w:p>
+      <w:pPr>
+        <w:pStyle w:val="BodyText"/>
+      </w:pPr>
+      <w:r>
+        <w:t xml:space="preserve">Szasz, T. S. (1960). The myth of mental illness.</w:t>
+      </w:r>
+      <w:r>
+        <w:t xml:space="preserve"> </w:t>
+      </w:r>
+      <w:r>
+        <w:rPr>
+          <w:iCs/>
+          <w:i/>
+        </w:rPr>
+        <w:t xml:space="preserve">American Psychologist</w:t>
+      </w:r>
+      <w:r>
+        <w:t xml:space="preserve">, 15(2), 113-118.</w:t>
+      </w:r>
+    </w:p>
+    <w:p>
+      <w:pPr>
+        <w:pStyle w:val="BodyText"/>
+      </w:pPr>
+      <w:r>
+        <w:t xml:space="preserve">Tsemberis, S., Gulcur, L., &amp; Nakae, M. (2004). Housing First, consumer choice, and harm reduction for individuals who are homeless and have co-occurring disorders.</w:t>
+      </w:r>
+      <w:r>
+        <w:t xml:space="preserve"> </w:t>
+      </w:r>
+      <w:r>
+        <w:rPr>
+          <w:iCs/>
+          <w:i/>
+        </w:rPr>
+        <w:t xml:space="preserve">American Journal of Public Health</w:t>
+      </w:r>
+      <w:r>
+        <w:t xml:space="preserve">, 94(4), 651–656.</w:t>
+      </w:r>
+    </w:p>
+    <w:p>
+      <w:pPr>
+        <w:pStyle w:val="BodyText"/>
+      </w:pPr>
+      <w:r>
+        <w:t xml:space="preserve">Walker, M. (2017).</w:t>
+      </w:r>
+      <w:r>
+        <w:t xml:space="preserve"> </w:t>
+      </w:r>
+      <w:r>
+        <w:rPr>
+          <w:iCs/>
+          <w:i/>
+        </w:rPr>
+        <w:t xml:space="preserve">Why we sleep: Unlocking the power of sleep and dreams</w:t>
+      </w:r>
+      <w:r>
+        <w:t xml:space="preserve">. Simon and Schuster.</w:t>
+      </w:r>
+    </w:p>
+    <w:p>
+      <w:pPr>
+        <w:pStyle w:val="BodyText"/>
+      </w:pPr>
+      <w:r>
+        <w:t xml:space="preserve">Westbrook, M., &amp; Robinson, T. (2021). Unhealthy by design: Health and safety consequences of the criminalization of homelessness.</w:t>
+      </w:r>
+      <w:r>
+        <w:t xml:space="preserve"> </w:t>
+      </w:r>
+      <w:r>
+        <w:rPr>
+          <w:iCs/>
+          <w:i/>
+        </w:rPr>
         <w:t xml:space="preserve">Journal of Social Distress and Homelessness</w:t>
       </w:r>
       <w:r>
         <w:t xml:space="preserve">, 30(2), 107–115.</w:t>
       </w:r>
     </w:p>
-    <w:bookmarkEnd w:id="63"/>
-    <w:bookmarkEnd w:id="64"/>
+    <w:bookmarkEnd w:id="65"/>
+    <w:bookmarkEnd w:id="66"/>
     <w:sectPr/>
   </w:body>
 </w:document>

</xml_diff>